<commit_message>
Agregar documento de descripción del problema
</commit_message>
<xml_diff>
--- a/DESCRIPCIÓN DEL PROBLEMA.docx
+++ b/DESCRIPCIÓN DEL PROBLEMA.docx
@@ -1,10 +1,11 @@
 
 <file path=word/document.xml><?xml version="1.0" encoding="utf-8"?>
-<w:document xmlns:wpc="http://schemas.microsoft.com/office/word/2010/wordprocessingCanvas" xmlns:cx="http://schemas.microsoft.com/office/drawing/2014/chartex" xmlns:cx1="http://schemas.microsoft.com/office/drawing/2015/9/8/chartex" xmlns:cx2="http://schemas.microsoft.com/office/drawing/2015/10/21/chartex" xmlns:cx3="http://schemas.microsoft.com/office/drawing/2016/5/9/chartex" xmlns:cx4="http://schemas.microsoft.com/office/drawing/2016/5/10/chartex" xmlns:cx5="http://schemas.microsoft.com/office/drawing/2016/5/11/chartex" xmlns:cx6="http://schemas.microsoft.com/office/drawing/2016/5/12/chartex" xmlns:cx7="http://schemas.microsoft.com/office/drawing/2016/5/13/chartex" xmlns:cx8="http://schemas.microsoft.com/office/drawing/2016/5/14/chartex" xmlns:mc="http://schemas.openxmlformats.org/markup-compatibility/2006" xmlns:aink="http://schemas.microsoft.com/office/drawing/2016/ink" xmlns:am3d="http://schemas.microsoft.com/office/drawing/2017/model3d" xmlns:o="urn:schemas-microsoft-com:office:office" xmlns:oel="http://schemas.microsoft.com/office/2019/extlst" xmlns:r="http://schemas.openxmlformats.org/officeDocument/2006/relationships" xmlns:m="http://schemas.openxmlformats.org/officeDocument/2006/math" xmlns:v="urn:schemas-microsoft-com:vml" xmlns:wp14="http://schemas.microsoft.com/office/word/2010/wordprocessingDrawing" xmlns:wp="http://schemas.openxmlformats.org/drawingml/2006/wordprocessingDrawing" xmlns:w10="urn:schemas-microsoft-com:office:word" xmlns:w="http://schemas.openxmlformats.org/wordprocessingml/2006/main" xmlns:w14="http://schemas.microsoft.com/office/word/2010/wordml" xmlns:w15="http://schemas.microsoft.com/office/word/2012/wordml" xmlns:w16cex="http://schemas.microsoft.com/office/word/2018/wordml/cex" xmlns:w16cid="http://schemas.microsoft.com/office/word/2016/wordml/cid" xmlns:w16="http://schemas.microsoft.com/office/word/2018/wordml" xmlns:w16du="http://schemas.microsoft.com/office/word/2023/wordml/word16du" xmlns:w16sdtdh="http://schemas.microsoft.com/office/word/2020/wordml/sdtdatahash" xmlns:w16sdtfl="http://schemas.microsoft.com/office/word/2024/wordml/sdtformatlock" xmlns:w16se="http://schemas.microsoft.com/office/word/2015/wordml/symex" xmlns:wpg="http://schemas.microsoft.com/office/word/2010/wordprocessingGroup" xmlns:wpi="http://schemas.microsoft.com/office/word/2010/wordprocessingInk" xmlns:wne="http://schemas.microsoft.com/office/word/2006/wordml" xmlns:wps="http://schemas.microsoft.com/office/word/2010/wordprocessingShape" mc:Ignorable="w14 w15 w16se w16cid w16 w16cex w16sdtdh w16sdtfl w16du wp14">
+<w:document xmlns:wpc="http://schemas.microsoft.com/office/word/2010/wordprocessingCanvas" xmlns:cx="http://schemas.microsoft.com/office/drawing/2014/chartex" xmlns:cx1="http://schemas.microsoft.com/office/drawing/2015/9/8/chartex" xmlns:cx2="http://schemas.microsoft.com/office/drawing/2015/10/21/chartex" xmlns:cx3="http://schemas.microsoft.com/office/drawing/2016/5/9/chartex" xmlns:cx4="http://schemas.microsoft.com/office/drawing/2016/5/10/chartex" xmlns:cx5="http://schemas.microsoft.com/office/drawing/2016/5/11/chartex" xmlns:cx6="http://schemas.microsoft.com/office/drawing/2016/5/12/chartex" xmlns:cx7="http://schemas.microsoft.com/office/drawing/2016/5/13/chartex" xmlns:cx8="http://schemas.microsoft.com/office/drawing/2016/5/14/chartex" xmlns:mc="http://schemas.openxmlformats.org/markup-compatibility/2006" xmlns:aink="http://schemas.microsoft.com/office/drawing/2016/ink" xmlns:am3d="http://schemas.microsoft.com/office/drawing/2017/model3d" xmlns:o="urn:schemas-microsoft-com:office:office" xmlns:oel="http://schemas.microsoft.com/office/2019/extlst" xmlns:r="http://schemas.openxmlformats.org/officeDocument/2006/relationships" xmlns:m="http://schemas.openxmlformats.org/officeDocument/2006/math" xmlns:v="urn:schemas-microsoft-com:vml" xmlns:wp14="http://schemas.microsoft.com/office/word/2010/wordprocessingDrawing" xmlns:wp="http://schemas.openxmlformats.org/drawingml/2006/wordprocessingDrawing" xmlns:w10="urn:schemas-microsoft-com:office:word" xmlns:w="http://schemas.openxmlformats.org/wordprocessingml/2006/main" xmlns:w14="http://schemas.microsoft.com/office/word/2010/wordml" xmlns:w15="http://schemas.microsoft.com/office/word/2012/wordml" xmlns:w16cex="http://schemas.microsoft.com/office/word/2018/wordml/cex" xmlns:w16cid="http://schemas.microsoft.com/office/word/2016/wordml/cid" xmlns:w16="http://schemas.microsoft.com/office/word/2018/wordml" xmlns:w16sdtdh="http://schemas.microsoft.com/office/word/2020/wordml/sdtdatahash" xmlns:w16se="http://schemas.microsoft.com/office/word/2015/wordml/symex" xmlns:wpg="http://schemas.microsoft.com/office/word/2010/wordprocessingGroup" xmlns:wpi="http://schemas.microsoft.com/office/word/2010/wordprocessingInk" xmlns:wne="http://schemas.microsoft.com/office/word/2006/wordml" xmlns:wps="http://schemas.microsoft.com/office/word/2010/wordprocessingShape" mc:Ignorable="w14 w15 w16se w16cid w16 w16cex w16sdtdh wp14">
   <w:body>
     <w:p>
       <w:pPr>
         <w:spacing w:before="100" w:beforeAutospacing="1" w:after="100" w:afterAutospacing="1" w:line="240" w:lineRule="auto"/>
+        <w:jc w:val="both"/>
         <w:outlineLvl w:val="1"/>
         <w:rPr>
           <w:rFonts w:ascii="Times New Roman" w:eastAsia="Times New Roman" w:hAnsi="Times New Roman" w:cs="Times New Roman"/>
@@ -28,6 +29,7 @@
     <w:p>
       <w:pPr>
         <w:spacing w:before="100" w:beforeAutospacing="1" w:after="100" w:afterAutospacing="1" w:line="240" w:lineRule="auto"/>
+        <w:jc w:val="both"/>
         <w:outlineLvl w:val="2"/>
         <w:rPr>
           <w:rFonts w:ascii="Times New Roman" w:eastAsia="Times New Roman" w:hAnsi="Times New Roman" w:cs="Times New Roman"/>
@@ -51,24 +53,77 @@
     <w:p>
       <w:pPr>
         <w:spacing w:before="100" w:beforeAutospacing="1" w:after="100" w:afterAutospacing="1" w:line="240" w:lineRule="auto"/>
-        <w:rPr>
-          <w:rFonts w:ascii="Times New Roman" w:eastAsia="Times New Roman" w:hAnsi="Times New Roman" w:cs="Times New Roman"/>
-          <w:kern w:val="0"/>
-          <w14:ligatures w14:val="none"/>
-        </w:rPr>
-      </w:pPr>
-      <w:r>
-        <w:rPr>
-          <w:rFonts w:ascii="Times New Roman" w:eastAsia="Times New Roman" w:hAnsi="Times New Roman" w:cs="Times New Roman"/>
-          <w:kern w:val="0"/>
-          <w14:ligatures w14:val="none"/>
-        </w:rPr>
-        <w:t>En la ingeniería estructural moderna, el concreto de alto desempeño (High Performance Concrete – HPC) constituye uno de los materiales más utilizados en edificaciones, puentes, estructuras industriales e infraestructura de gran exigencia mecánica. Su comportamiento estructural depende principalmente de su resistencia a compresión, propiedad fundamental para el diseño, análisis y verificación de elementos estructurales.</w:t>
-      </w:r>
-    </w:p>
-    <w:p>
-      <w:pPr>
-        <w:spacing w:before="100" w:beforeAutospacing="1" w:after="100" w:afterAutospacing="1" w:line="240" w:lineRule="auto"/>
+        <w:jc w:val="both"/>
+        <w:rPr>
+          <w:rFonts w:ascii="Times New Roman" w:eastAsia="Times New Roman" w:hAnsi="Times New Roman" w:cs="Times New Roman"/>
+          <w:kern w:val="0"/>
+          <w14:ligatures w14:val="none"/>
+        </w:rPr>
+      </w:pPr>
+      <w:r>
+        <w:rPr>
+          <w:rFonts w:ascii="Times New Roman" w:eastAsia="Times New Roman" w:hAnsi="Times New Roman" w:cs="Times New Roman"/>
+          <w:kern w:val="0"/>
+          <w14:ligatures w14:val="none"/>
+        </w:rPr>
+        <w:t xml:space="preserve">En la ingeniería estructural moderna, el </w:t>
+      </w:r>
+      <w:r>
+        <w:rPr>
+          <w:rFonts w:ascii="Times New Roman" w:eastAsia="Times New Roman" w:hAnsi="Times New Roman" w:cs="Times New Roman"/>
+          <w:kern w:val="0"/>
+          <w:lang w:val="es-PE"/>
+          <w14:ligatures w14:val="none"/>
+        </w:rPr>
+        <w:t>C</w:t>
+      </w:r>
+      <w:r>
+        <w:rPr>
+          <w:rFonts w:ascii="Times New Roman" w:eastAsia="Times New Roman" w:hAnsi="Times New Roman" w:cs="Times New Roman"/>
+          <w:kern w:val="0"/>
+          <w14:ligatures w14:val="none"/>
+        </w:rPr>
+        <w:t xml:space="preserve">oncreto de </w:t>
+      </w:r>
+      <w:r>
+        <w:rPr>
+          <w:rFonts w:ascii="Times New Roman" w:eastAsia="Times New Roman" w:hAnsi="Times New Roman" w:cs="Times New Roman"/>
+          <w:kern w:val="0"/>
+          <w:lang w:val="es-PE"/>
+          <w14:ligatures w14:val="none"/>
+        </w:rPr>
+        <w:t>A</w:t>
+      </w:r>
+      <w:r>
+        <w:rPr>
+          <w:rFonts w:ascii="Times New Roman" w:eastAsia="Times New Roman" w:hAnsi="Times New Roman" w:cs="Times New Roman"/>
+          <w:kern w:val="0"/>
+          <w14:ligatures w14:val="none"/>
+        </w:rPr>
+        <w:t xml:space="preserve">lto </w:t>
+      </w:r>
+      <w:r>
+        <w:rPr>
+          <w:rFonts w:ascii="Times New Roman" w:eastAsia="Times New Roman" w:hAnsi="Times New Roman" w:cs="Times New Roman"/>
+          <w:kern w:val="0"/>
+          <w:lang w:val="es-PE"/>
+          <w14:ligatures w14:val="none"/>
+        </w:rPr>
+        <w:t>D</w:t>
+      </w:r>
+      <w:r>
+        <w:rPr>
+          <w:rFonts w:ascii="Times New Roman" w:eastAsia="Times New Roman" w:hAnsi="Times New Roman" w:cs="Times New Roman"/>
+          <w:kern w:val="0"/>
+          <w14:ligatures w14:val="none"/>
+        </w:rPr>
+        <w:t>esempeño (High Performance Concrete – HPC) constituye uno de los materiales más utilizados en edificaciones, puentes, estructuras industriales e infraestructura de gran exigencia mecánica. Su comportamiento estructural depende principalmente de su resistencia a compresión, propiedad fundamental para el diseño, análisis y verificación de elementos estructurales.</w:t>
+      </w:r>
+    </w:p>
+    <w:p>
+      <w:pPr>
+        <w:spacing w:before="100" w:beforeAutospacing="1" w:after="100" w:afterAutospacing="1" w:line="240" w:lineRule="auto"/>
+        <w:jc w:val="both"/>
         <w:rPr>
           <w:rFonts w:ascii="Times New Roman" w:eastAsia="Times New Roman" w:hAnsi="Times New Roman" w:cs="Times New Roman"/>
           <w:kern w:val="0"/>
@@ -87,6 +142,7 @@
     <w:p>
       <w:pPr>
         <w:spacing w:before="100" w:beforeAutospacing="1" w:after="100" w:afterAutospacing="1" w:line="240" w:lineRule="auto"/>
+        <w:jc w:val="both"/>
         <w:rPr>
           <w:rFonts w:ascii="Times New Roman" w:eastAsia="Times New Roman" w:hAnsi="Times New Roman" w:cs="Times New Roman"/>
           <w:kern w:val="0"/>
@@ -105,6 +161,7 @@
     <w:p>
       <w:pPr>
         <w:spacing w:before="100" w:beforeAutospacing="1" w:after="100" w:afterAutospacing="1" w:line="240" w:lineRule="auto"/>
+        <w:jc w:val="both"/>
         <w:rPr>
           <w:rFonts w:ascii="Times New Roman" w:eastAsia="Times New Roman" w:hAnsi="Times New Roman" w:cs="Times New Roman"/>
           <w:kern w:val="0"/>
@@ -123,6 +180,7 @@
     <w:p>
       <w:pPr>
         <w:spacing w:before="100" w:beforeAutospacing="1" w:after="100" w:afterAutospacing="1" w:line="240" w:lineRule="auto"/>
+        <w:jc w:val="both"/>
         <w:outlineLvl w:val="1"/>
         <w:rPr>
           <w:rFonts w:ascii="Times New Roman" w:eastAsia="Times New Roman" w:hAnsi="Times New Roman" w:cs="Times New Roman"/>
@@ -146,9 +204,11 @@
     <w:p>
       <w:pPr>
         <w:spacing w:before="100" w:beforeAutospacing="1" w:after="100" w:afterAutospacing="1" w:line="240" w:lineRule="auto"/>
-        <w:rPr>
-          <w:rFonts w:ascii="Times New Roman" w:eastAsia="Times New Roman" w:hAnsi="Times New Roman" w:cs="Times New Roman"/>
-          <w:kern w:val="0"/>
+        <w:jc w:val="both"/>
+        <w:rPr>
+          <w:rFonts w:ascii="Times New Roman" w:eastAsia="Times New Roman" w:hAnsi="Times New Roman" w:cs="Times New Roman"/>
+          <w:kern w:val="0"/>
+          <w:lang w:val="es-PE"/>
           <w14:ligatures w14:val="none"/>
         </w:rPr>
       </w:pPr>
@@ -164,24 +224,196 @@
     <w:p>
       <w:pPr>
         <w:spacing w:before="100" w:beforeAutospacing="1" w:after="100" w:afterAutospacing="1" w:line="240" w:lineRule="auto"/>
-        <w:rPr>
-          <w:rFonts w:ascii="Times New Roman" w:eastAsia="Times New Roman" w:hAnsi="Times New Roman" w:cs="Times New Roman"/>
-          <w:kern w:val="0"/>
-          <w14:ligatures w14:val="none"/>
-        </w:rPr>
-      </w:pPr>
-      <w:r>
-        <w:rPr>
-          <w:rFonts w:ascii="Times New Roman" w:eastAsia="Times New Roman" w:hAnsi="Times New Roman" w:cs="Times New Roman"/>
-          <w:kern w:val="0"/>
-          <w14:ligatures w14:val="none"/>
-        </w:rPr>
-        <w:t>La resistencia a compresión del concreto depende de múltiples variables relacionadas con su composición, tales como la cantidad de cemento, agua, agregados, aditivos, cenizas y edad de curado. Estas relaciones presentan comportamientos altamente no lineales y complejos, lo que dificulta su modelamiento mediante métodos matemáticos tradicionales.</w:t>
-      </w:r>
-    </w:p>
-    <w:p>
-      <w:pPr>
-        <w:spacing w:before="100" w:beforeAutospacing="1" w:after="100" w:afterAutospacing="1" w:line="240" w:lineRule="auto"/>
+        <w:jc w:val="both"/>
+        <w:rPr>
+          <w:rFonts w:ascii="Times New Roman" w:eastAsia="Times New Roman" w:hAnsi="Times New Roman" w:cs="Times New Roman"/>
+          <w:kern w:val="0"/>
+          <w:lang w:val="es-PE"/>
+          <w14:ligatures w14:val="none"/>
+        </w:rPr>
+      </w:pPr>
+      <w:r>
+        <w:rPr>
+          <w:rFonts w:ascii="Times New Roman" w:eastAsia="Times New Roman" w:hAnsi="Times New Roman" w:cs="Times New Roman"/>
+          <w:kern w:val="0"/>
+          <w:lang w:val="es-PE"/>
+          <w14:ligatures w14:val="none"/>
+        </w:rPr>
+        <w:t xml:space="preserve">El artículo señala que, </w:t>
+      </w:r>
+      <w:r>
+        <w:rPr>
+          <w:rFonts w:ascii="Times New Roman" w:eastAsia="Times New Roman" w:hAnsi="Times New Roman" w:cs="Times New Roman"/>
+          <w:kern w:val="0"/>
+          <w14:ligatures w14:val="none"/>
+        </w:rPr>
+        <w:t>la predicción de la resistencia del concreto ha dependido de la conocida ley de Abrams, la cual establece que la resistencia del concreto está principalmente determinada por la relación agua/cemento (</w:t>
+      </w:r>
+      <w:r>
+        <w:rPr>
+          <w:rFonts w:ascii="Times New Roman" w:eastAsia="Times New Roman" w:hAnsi="Times New Roman" w:cs="Times New Roman"/>
+          <w:kern w:val="0"/>
+          <w:lang w:val="es-PE"/>
+          <w14:ligatures w14:val="none"/>
+        </w:rPr>
+        <w:t>a</w:t>
+      </w:r>
+      <w:r>
+        <w:rPr>
+          <w:rFonts w:ascii="Times New Roman" w:eastAsia="Times New Roman" w:hAnsi="Times New Roman" w:cs="Times New Roman"/>
+          <w:kern w:val="0"/>
+          <w14:ligatures w14:val="none"/>
+        </w:rPr>
+        <w:t>/c), indicando una relación inversamente proporcional: a menor cantidad de agua respecto al cemento, mayor resistencia mecánica del material.</w:t>
+      </w:r>
+    </w:p>
+    <w:p>
+      <w:pPr>
+        <w:spacing w:before="100" w:beforeAutospacing="1" w:after="100" w:afterAutospacing="1" w:line="240" w:lineRule="auto"/>
+        <w:jc w:val="both"/>
+        <w:rPr>
+          <w:rFonts w:ascii="Times New Roman" w:eastAsia="Times New Roman" w:hAnsi="Times New Roman" w:cs="Times New Roman"/>
+          <w:kern w:val="0"/>
+          <w:lang w:val="es-PE"/>
+          <w14:ligatures w14:val="none"/>
+        </w:rPr>
+      </w:pPr>
+      <w:r>
+        <w:rPr>
+          <w:rFonts w:ascii="Times New Roman" w:eastAsia="Times New Roman" w:hAnsi="Times New Roman" w:cs="Times New Roman"/>
+          <w:kern w:val="0"/>
+          <w14:ligatures w14:val="none"/>
+        </w:rPr>
+        <w:t xml:space="preserve">Sin embargo, esta aproximación presenta limitaciones importantes cuando se aplica al </w:t>
+      </w:r>
+      <w:r>
+        <w:rPr>
+          <w:rFonts w:ascii="Times New Roman" w:eastAsia="Times New Roman" w:hAnsi="Times New Roman" w:cs="Times New Roman"/>
+          <w:kern w:val="0"/>
+          <w:lang w:val="es-PE"/>
+          <w14:ligatures w14:val="none"/>
+        </w:rPr>
+        <w:t>HPC</w:t>
+      </w:r>
+      <w:r>
+        <w:rPr>
+          <w:rFonts w:ascii="Times New Roman" w:eastAsia="Times New Roman" w:hAnsi="Times New Roman" w:cs="Times New Roman"/>
+          <w:kern w:val="0"/>
+          <w14:ligatures w14:val="none"/>
+        </w:rPr>
+        <w:t>. A diferencia del concreto convencional, el HPC es un material considerablemente más complejo debido a la incorporación de materiales cementantes suplementarios, tales como ceniza volante y escoria de alto horno, además de aditivos químicos como los superplastificantes, los cuales modifican el comportamiento mecánico del material. Como consecuencia, la resistencia del concreto deja de depender exclusivamente de la relación agua/cemento y pasa a estar influenciada por múltiples variables que interactúan simultáneamente.</w:t>
+      </w:r>
+    </w:p>
+    <w:p>
+      <w:pPr>
+        <w:spacing w:before="100" w:beforeAutospacing="1" w:after="100" w:afterAutospacing="1" w:line="240" w:lineRule="auto"/>
+        <w:jc w:val="both"/>
+        <w:rPr>
+          <w:rFonts w:ascii="Times New Roman" w:eastAsia="Times New Roman" w:hAnsi="Times New Roman" w:cs="Times New Roman"/>
+          <w:kern w:val="0"/>
+          <w14:ligatures w14:val="none"/>
+        </w:rPr>
+      </w:pPr>
+      <w:r>
+        <w:rPr>
+          <w:rFonts w:ascii="Times New Roman" w:eastAsia="Times New Roman" w:hAnsi="Times New Roman" w:cs="Times New Roman"/>
+          <w:kern w:val="0"/>
+          <w:lang w:val="es-PE"/>
+          <w14:ligatures w14:val="none"/>
+        </w:rPr>
+        <w:lastRenderedPageBreak/>
+        <w:t>En ese sentido, l</w:t>
+      </w:r>
+      <w:r>
+        <w:rPr>
+          <w:rFonts w:ascii="Times New Roman" w:eastAsia="Times New Roman" w:hAnsi="Times New Roman" w:cs="Times New Roman"/>
+          <w:kern w:val="0"/>
+          <w14:ligatures w14:val="none"/>
+        </w:rPr>
+        <w:t xml:space="preserve">a resistencia a compresión del </w:t>
+      </w:r>
+      <w:r>
+        <w:rPr>
+          <w:rFonts w:ascii="Times New Roman" w:eastAsia="Times New Roman" w:hAnsi="Times New Roman" w:cs="Times New Roman"/>
+          <w:kern w:val="0"/>
+          <w:lang w:val="es-PE"/>
+          <w14:ligatures w14:val="none"/>
+        </w:rPr>
+        <w:t>HPC</w:t>
+      </w:r>
+      <w:r>
+        <w:rPr>
+          <w:rFonts w:ascii="Times New Roman" w:eastAsia="Times New Roman" w:hAnsi="Times New Roman" w:cs="Times New Roman"/>
+          <w:kern w:val="0"/>
+          <w14:ligatures w14:val="none"/>
+        </w:rPr>
+        <w:t xml:space="preserve"> </w:t>
+      </w:r>
+      <w:r>
+        <w:rPr>
+          <w:rFonts w:ascii="Times New Roman" w:eastAsia="Times New Roman" w:hAnsi="Times New Roman" w:cs="Times New Roman"/>
+          <w:kern w:val="0"/>
+          <w:lang w:val="es-PE"/>
+          <w14:ligatures w14:val="none"/>
+        </w:rPr>
+        <w:t>depende</w:t>
+      </w:r>
+      <w:r>
+        <w:rPr>
+          <w:rFonts w:ascii="Times New Roman" w:eastAsia="Times New Roman" w:hAnsi="Times New Roman" w:cs="Times New Roman"/>
+          <w:kern w:val="0"/>
+          <w14:ligatures w14:val="none"/>
+        </w:rPr>
+        <w:t xml:space="preserve"> </w:t>
+      </w:r>
+      <w:r>
+        <w:rPr>
+          <w:rFonts w:ascii="Times New Roman" w:eastAsia="Times New Roman" w:hAnsi="Times New Roman" w:cs="Times New Roman"/>
+          <w:kern w:val="0"/>
+          <w:lang w:val="es-PE"/>
+          <w14:ligatures w14:val="none"/>
+        </w:rPr>
+        <w:t xml:space="preserve">de </w:t>
+      </w:r>
+      <w:r>
+        <w:rPr>
+          <w:rFonts w:ascii="Times New Roman" w:eastAsia="Times New Roman" w:hAnsi="Times New Roman" w:cs="Times New Roman"/>
+          <w:kern w:val="0"/>
+          <w14:ligatures w14:val="none"/>
+        </w:rPr>
+        <w:t>múltiples variables relacionadas con su composición, tales como la cantidad de cemento, agua, agregado</w:t>
+      </w:r>
+      <w:r>
+        <w:rPr>
+          <w:rFonts w:ascii="Times New Roman" w:eastAsia="Times New Roman" w:hAnsi="Times New Roman" w:cs="Times New Roman"/>
+          <w:kern w:val="0"/>
+          <w:lang w:val="es-PE"/>
+          <w14:ligatures w14:val="none"/>
+        </w:rPr>
+        <w:t xml:space="preserve"> fino y </w:t>
+      </w:r>
+      <w:r>
+        <w:rPr>
+          <w:rFonts w:ascii="Times New Roman" w:eastAsia="Times New Roman" w:hAnsi="Times New Roman" w:cs="Times New Roman"/>
+          <w:kern w:val="0"/>
+          <w:lang w:val="es-PE"/>
+          <w14:ligatures w14:val="none"/>
+        </w:rPr>
+        <w:t>grueso</w:t>
+      </w:r>
+      <w:r>
+        <w:rPr>
+          <w:rFonts w:ascii="Times New Roman" w:eastAsia="Times New Roman" w:hAnsi="Times New Roman" w:cs="Times New Roman"/>
+          <w:kern w:val="0"/>
+          <w14:ligatures w14:val="none"/>
+        </w:rPr>
+        <w:t>, aditivos, cenizas y edad de curado. Estas relaciones presentan comportamientos altamente no lineales y complejos, lo que dificulta su modelamiento mediante métodos matemáticos tradicionales.</w:t>
+      </w:r>
+    </w:p>
+    <w:p>
+      <w:pPr>
+        <w:spacing w:before="100" w:beforeAutospacing="1" w:after="100" w:afterAutospacing="1" w:line="240" w:lineRule="auto"/>
+        <w:jc w:val="both"/>
         <w:rPr>
           <w:rFonts w:ascii="Times New Roman" w:eastAsia="Times New Roman" w:hAnsi="Times New Roman" w:cs="Times New Roman"/>
           <w:kern w:val="0"/>
@@ -204,6 +436,7 @@
           <w:numId w:val="1"/>
         </w:numPr>
         <w:spacing w:before="100" w:beforeAutospacing="1" w:after="100" w:afterAutospacing="1" w:line="240" w:lineRule="auto"/>
+        <w:jc w:val="both"/>
         <w:rPr>
           <w:rFonts w:ascii="Times New Roman" w:eastAsia="Times New Roman" w:hAnsi="Times New Roman" w:cs="Times New Roman"/>
           <w:kern w:val="0"/>
@@ -226,6 +459,7 @@
           <w:numId w:val="1"/>
         </w:numPr>
         <w:spacing w:before="100" w:beforeAutospacing="1" w:after="100" w:afterAutospacing="1" w:line="240" w:lineRule="auto"/>
+        <w:jc w:val="both"/>
         <w:rPr>
           <w:rFonts w:ascii="Times New Roman" w:eastAsia="Times New Roman" w:hAnsi="Times New Roman" w:cs="Times New Roman"/>
           <w:kern w:val="0"/>
@@ -248,6 +482,7 @@
           <w:numId w:val="1"/>
         </w:numPr>
         <w:spacing w:before="100" w:beforeAutospacing="1" w:after="100" w:afterAutospacing="1" w:line="240" w:lineRule="auto"/>
+        <w:jc w:val="both"/>
         <w:rPr>
           <w:rFonts w:ascii="Times New Roman" w:eastAsia="Times New Roman" w:hAnsi="Times New Roman" w:cs="Times New Roman"/>
           <w:kern w:val="0"/>
@@ -270,6 +505,7 @@
           <w:numId w:val="1"/>
         </w:numPr>
         <w:spacing w:before="100" w:beforeAutospacing="1" w:after="100" w:afterAutospacing="1" w:line="240" w:lineRule="auto"/>
+        <w:jc w:val="both"/>
         <w:rPr>
           <w:rFonts w:ascii="Times New Roman" w:eastAsia="Times New Roman" w:hAnsi="Times New Roman" w:cs="Times New Roman"/>
           <w:kern w:val="0"/>
@@ -292,6 +528,7 @@
           <w:numId w:val="1"/>
         </w:numPr>
         <w:spacing w:before="100" w:beforeAutospacing="1" w:after="100" w:afterAutospacing="1" w:line="240" w:lineRule="auto"/>
+        <w:jc w:val="both"/>
         <w:rPr>
           <w:rFonts w:ascii="Times New Roman" w:eastAsia="Times New Roman" w:hAnsi="Times New Roman" w:cs="Times New Roman"/>
           <w:kern w:val="0"/>
@@ -310,25 +547,26 @@
     <w:p>
       <w:pPr>
         <w:spacing w:before="100" w:beforeAutospacing="1" w:after="100" w:afterAutospacing="1" w:line="240" w:lineRule="auto"/>
-        <w:rPr>
-          <w:rFonts w:ascii="Times New Roman" w:eastAsia="Times New Roman" w:hAnsi="Times New Roman" w:cs="Times New Roman"/>
-          <w:kern w:val="0"/>
-          <w14:ligatures w14:val="none"/>
-        </w:rPr>
-      </w:pPr>
-      <w:r>
-        <w:rPr>
-          <w:rFonts w:ascii="Times New Roman" w:eastAsia="Times New Roman" w:hAnsi="Times New Roman" w:cs="Times New Roman"/>
-          <w:kern w:val="0"/>
-          <w14:ligatures w14:val="none"/>
-        </w:rPr>
-        <w:lastRenderedPageBreak/>
+        <w:jc w:val="both"/>
+        <w:rPr>
+          <w:rFonts w:ascii="Times New Roman" w:eastAsia="Times New Roman" w:hAnsi="Times New Roman" w:cs="Times New Roman"/>
+          <w:kern w:val="0"/>
+          <w14:ligatures w14:val="none"/>
+        </w:rPr>
+      </w:pPr>
+      <w:r>
+        <w:rPr>
+          <w:rFonts w:ascii="Times New Roman" w:eastAsia="Times New Roman" w:hAnsi="Times New Roman" w:cs="Times New Roman"/>
+          <w:kern w:val="0"/>
+          <w14:ligatures w14:val="none"/>
+        </w:rPr>
         <w:t>Asimismo, el diseño experimental de mezclas de concreto requiere tiempo considerable debido a los periodos de curado y validación, afectando la productividad en proyectos de construcción y procesos de investigación estructural.</w:t>
       </w:r>
     </w:p>
     <w:p>
       <w:pPr>
         <w:spacing w:before="100" w:beforeAutospacing="1" w:after="100" w:afterAutospacing="1" w:line="240" w:lineRule="auto"/>
+        <w:jc w:val="both"/>
         <w:rPr>
           <w:rFonts w:ascii="Times New Roman" w:eastAsia="Times New Roman" w:hAnsi="Times New Roman" w:cs="Times New Roman"/>
           <w:kern w:val="0"/>
@@ -347,6 +585,7 @@
     <w:p>
       <w:pPr>
         <w:spacing w:before="100" w:beforeAutospacing="1" w:after="100" w:afterAutospacing="1" w:line="240" w:lineRule="auto"/>
+        <w:jc w:val="both"/>
         <w:outlineLvl w:val="1"/>
         <w:rPr>
           <w:rFonts w:ascii="Times New Roman" w:eastAsia="Times New Roman" w:hAnsi="Times New Roman" w:cs="Times New Roman"/>
@@ -370,6 +609,7 @@
     <w:p>
       <w:pPr>
         <w:spacing w:before="100" w:beforeAutospacing="1" w:after="100" w:afterAutospacing="1" w:line="240" w:lineRule="auto"/>
+        <w:jc w:val="both"/>
         <w:rPr>
           <w:rFonts w:ascii="Times New Roman" w:eastAsia="Times New Roman" w:hAnsi="Times New Roman" w:cs="Times New Roman"/>
           <w:kern w:val="0"/>
@@ -388,6 +628,7 @@
     <w:p>
       <w:pPr>
         <w:spacing w:before="100" w:beforeAutospacing="1" w:after="100" w:afterAutospacing="1" w:line="240" w:lineRule="auto"/>
+        <w:jc w:val="both"/>
         <w:rPr>
           <w:rFonts w:ascii="Times New Roman" w:eastAsia="Times New Roman" w:hAnsi="Times New Roman" w:cs="Times New Roman"/>
           <w:kern w:val="0"/>
@@ -410,6 +651,7 @@
           <w:numId w:val="2"/>
         </w:numPr>
         <w:spacing w:before="100" w:beforeAutospacing="1" w:after="100" w:afterAutospacing="1" w:line="240" w:lineRule="auto"/>
+        <w:jc w:val="both"/>
         <w:rPr>
           <w:rFonts w:ascii="Times New Roman" w:eastAsia="Times New Roman" w:hAnsi="Times New Roman" w:cs="Times New Roman"/>
           <w:kern w:val="0"/>
@@ -432,6 +674,7 @@
           <w:numId w:val="2"/>
         </w:numPr>
         <w:spacing w:before="100" w:beforeAutospacing="1" w:after="100" w:afterAutospacing="1" w:line="240" w:lineRule="auto"/>
+        <w:jc w:val="both"/>
         <w:rPr>
           <w:rFonts w:ascii="Times New Roman" w:eastAsia="Times New Roman" w:hAnsi="Times New Roman" w:cs="Times New Roman"/>
           <w:kern w:val="0"/>
@@ -454,6 +697,7 @@
           <w:numId w:val="2"/>
         </w:numPr>
         <w:spacing w:before="100" w:beforeAutospacing="1" w:after="100" w:afterAutospacing="1" w:line="240" w:lineRule="auto"/>
+        <w:jc w:val="both"/>
         <w:rPr>
           <w:rFonts w:ascii="Times New Roman" w:eastAsia="Times New Roman" w:hAnsi="Times New Roman" w:cs="Times New Roman"/>
           <w:kern w:val="0"/>
@@ -476,6 +720,7 @@
           <w:numId w:val="2"/>
         </w:numPr>
         <w:spacing w:before="100" w:beforeAutospacing="1" w:after="100" w:afterAutospacing="1" w:line="240" w:lineRule="auto"/>
+        <w:jc w:val="both"/>
         <w:rPr>
           <w:rFonts w:ascii="Times New Roman" w:eastAsia="Times New Roman" w:hAnsi="Times New Roman" w:cs="Times New Roman"/>
           <w:kern w:val="0"/>
@@ -498,6 +743,7 @@
           <w:numId w:val="2"/>
         </w:numPr>
         <w:spacing w:before="100" w:beforeAutospacing="1" w:after="100" w:afterAutospacing="1" w:line="240" w:lineRule="auto"/>
+        <w:jc w:val="both"/>
         <w:rPr>
           <w:rFonts w:ascii="Times New Roman" w:eastAsia="Times New Roman" w:hAnsi="Times New Roman" w:cs="Times New Roman"/>
           <w:kern w:val="0"/>
@@ -516,6 +762,7 @@
     <w:p>
       <w:pPr>
         <w:spacing w:before="100" w:beforeAutospacing="1" w:after="100" w:afterAutospacing="1" w:line="240" w:lineRule="auto"/>
+        <w:jc w:val="both"/>
         <w:rPr>
           <w:rFonts w:ascii="Times New Roman" w:eastAsia="Times New Roman" w:hAnsi="Times New Roman" w:cs="Times New Roman"/>
           <w:kern w:val="0"/>
@@ -534,6 +781,7 @@
     <w:p>
       <w:pPr>
         <w:spacing w:before="100" w:beforeAutospacing="1" w:after="100" w:afterAutospacing="1" w:line="240" w:lineRule="auto"/>
+        <w:jc w:val="both"/>
         <w:outlineLvl w:val="1"/>
         <w:rPr>
           <w:rFonts w:ascii="Times New Roman" w:eastAsia="Times New Roman" w:hAnsi="Times New Roman" w:cs="Times New Roman"/>
@@ -557,24 +805,60 @@
     <w:p>
       <w:pPr>
         <w:spacing w:before="100" w:beforeAutospacing="1" w:after="100" w:afterAutospacing="1" w:line="240" w:lineRule="auto"/>
-        <w:rPr>
-          <w:rFonts w:ascii="Times New Roman" w:eastAsia="Times New Roman" w:hAnsi="Times New Roman" w:cs="Times New Roman"/>
-          <w:kern w:val="0"/>
-          <w14:ligatures w14:val="none"/>
-        </w:rPr>
-      </w:pPr>
-      <w:r>
-        <w:rPr>
-          <w:rFonts w:ascii="Times New Roman" w:eastAsia="Times New Roman" w:hAnsi="Times New Roman" w:cs="Times New Roman"/>
-          <w:kern w:val="0"/>
-          <w14:ligatures w14:val="none"/>
-        </w:rPr>
-        <w:t>Desarrollar un modelo predictivo basado en Redes Neuronales Artificiales que permita estimar la resistencia a compresión del concreto de alto desempeño en función de las proporciones de sus componentes.</w:t>
-      </w:r>
-    </w:p>
-    <w:p>
-      <w:pPr>
-        <w:spacing w:before="100" w:beforeAutospacing="1" w:after="100" w:afterAutospacing="1" w:line="240" w:lineRule="auto"/>
+        <w:jc w:val="both"/>
+        <w:rPr>
+          <w:rFonts w:ascii="Times New Roman" w:eastAsia="Times New Roman" w:hAnsi="Times New Roman" w:cs="Times New Roman"/>
+          <w:kern w:val="0"/>
+          <w14:ligatures w14:val="none"/>
+        </w:rPr>
+      </w:pPr>
+      <w:r>
+        <w:rPr>
+          <w:rFonts w:ascii="Times New Roman" w:eastAsia="Times New Roman" w:hAnsi="Times New Roman" w:cs="Times New Roman"/>
+          <w:kern w:val="0"/>
+          <w14:ligatures w14:val="none"/>
+        </w:rPr>
+        <w:t>Desarrollar un modelo predictivo basado en Redes Neuronales Artificiales</w:t>
+      </w:r>
+      <w:r>
+        <w:rPr>
+          <w:rFonts w:ascii="Times New Roman" w:eastAsia="Times New Roman" w:hAnsi="Times New Roman" w:cs="Times New Roman"/>
+          <w:kern w:val="0"/>
+          <w:lang w:val="es-PE"/>
+          <w14:ligatures w14:val="none"/>
+        </w:rPr>
+        <w:t xml:space="preserve"> (ANN)</w:t>
+      </w:r>
+      <w:r>
+        <w:rPr>
+          <w:rFonts w:ascii="Times New Roman" w:eastAsia="Times New Roman" w:hAnsi="Times New Roman" w:cs="Times New Roman"/>
+          <w:kern w:val="0"/>
+          <w14:ligatures w14:val="none"/>
+        </w:rPr>
+        <w:t xml:space="preserve"> que permita estimar la resistencia a compresión del concreto de alto desempeño</w:t>
+      </w:r>
+      <w:r>
+        <w:rPr>
+          <w:rFonts w:ascii="Times New Roman" w:eastAsia="Times New Roman" w:hAnsi="Times New Roman" w:cs="Times New Roman"/>
+          <w:kern w:val="0"/>
+          <w:lang w:val="es-PE"/>
+          <w14:ligatures w14:val="none"/>
+        </w:rPr>
+        <w:t xml:space="preserve"> (HPC)</w:t>
+      </w:r>
+      <w:r>
+        <w:rPr>
+          <w:rFonts w:ascii="Times New Roman" w:eastAsia="Times New Roman" w:hAnsi="Times New Roman" w:cs="Times New Roman"/>
+          <w:kern w:val="0"/>
+          <w14:ligatures w14:val="none"/>
+        </w:rPr>
+        <w:t xml:space="preserve"> en función de las proporciones de sus componentes.</w:t>
+      </w:r>
+    </w:p>
+    <w:p>
+      <w:pPr>
+        <w:spacing w:before="100" w:beforeAutospacing="1" w:after="100" w:afterAutospacing="1" w:line="240" w:lineRule="auto"/>
+        <w:jc w:val="both"/>
         <w:outlineLvl w:val="1"/>
         <w:rPr>
           <w:rFonts w:ascii="Times New Roman" w:eastAsia="Times New Roman" w:hAnsi="Times New Roman" w:cs="Times New Roman"/>
@@ -592,6 +876,7 @@
           <w:kern w:val="0"/>
           <w14:ligatures w14:val="none"/>
         </w:rPr>
+        <w:lastRenderedPageBreak/>
         <w:t>5. Objetivos Específicos</w:t>
       </w:r>
     </w:p>
@@ -602,6 +887,7 @@
           <w:numId w:val="3"/>
         </w:numPr>
         <w:spacing w:before="100" w:beforeAutospacing="1" w:after="100" w:afterAutospacing="1" w:line="240" w:lineRule="auto"/>
+        <w:jc w:val="both"/>
         <w:rPr>
           <w:rFonts w:ascii="Times New Roman" w:eastAsia="Times New Roman" w:hAnsi="Times New Roman" w:cs="Times New Roman"/>
           <w:kern w:val="0"/>
@@ -624,6 +910,7 @@
           <w:numId w:val="3"/>
         </w:numPr>
         <w:spacing w:before="100" w:beforeAutospacing="1" w:after="100" w:afterAutospacing="1" w:line="240" w:lineRule="auto"/>
+        <w:jc w:val="both"/>
         <w:rPr>
           <w:rFonts w:ascii="Times New Roman" w:eastAsia="Times New Roman" w:hAnsi="Times New Roman" w:cs="Times New Roman"/>
           <w:kern w:val="0"/>
@@ -646,6 +933,7 @@
           <w:numId w:val="3"/>
         </w:numPr>
         <w:spacing w:before="100" w:beforeAutospacing="1" w:after="100" w:afterAutospacing="1" w:line="240" w:lineRule="auto"/>
+        <w:jc w:val="both"/>
         <w:rPr>
           <w:rFonts w:ascii="Times New Roman" w:eastAsia="Times New Roman" w:hAnsi="Times New Roman" w:cs="Times New Roman"/>
           <w:kern w:val="0"/>
@@ -668,6 +956,7 @@
           <w:numId w:val="3"/>
         </w:numPr>
         <w:spacing w:before="100" w:beforeAutospacing="1" w:after="100" w:afterAutospacing="1" w:line="240" w:lineRule="auto"/>
+        <w:jc w:val="both"/>
         <w:rPr>
           <w:rFonts w:ascii="Times New Roman" w:eastAsia="Times New Roman" w:hAnsi="Times New Roman" w:cs="Times New Roman"/>
           <w:kern w:val="0"/>
@@ -690,6 +979,7 @@
           <w:numId w:val="3"/>
         </w:numPr>
         <w:spacing w:before="100" w:beforeAutospacing="1" w:after="100" w:afterAutospacing="1" w:line="240" w:lineRule="auto"/>
+        <w:jc w:val="both"/>
         <w:rPr>
           <w:rFonts w:ascii="Times New Roman" w:eastAsia="Times New Roman" w:hAnsi="Times New Roman" w:cs="Times New Roman"/>
           <w:kern w:val="0"/>
@@ -712,6 +1002,76 @@
           <w:numId w:val="3"/>
         </w:numPr>
         <w:spacing w:before="100" w:beforeAutospacing="1" w:after="100" w:afterAutospacing="1" w:line="240" w:lineRule="auto"/>
+        <w:jc w:val="both"/>
+        <w:rPr>
+          <w:rFonts w:ascii="Times New Roman" w:eastAsia="Times New Roman" w:hAnsi="Times New Roman" w:cs="Times New Roman"/>
+          <w:kern w:val="0"/>
+          <w14:ligatures w14:val="none"/>
+        </w:rPr>
+      </w:pPr>
+      <w:r>
+        <w:rPr>
+          <w:rFonts w:ascii="Times New Roman" w:eastAsia="Times New Roman" w:hAnsi="Times New Roman" w:cs="Times New Roman"/>
+          <w:kern w:val="0"/>
+          <w14:ligatures w14:val="none"/>
+        </w:rPr>
+        <w:t>Alimentar el modelo con distintos datos experimentales.</w:t>
+      </w:r>
+    </w:p>
+    <w:p>
+      <w:pPr>
+        <w:numPr>
+          <w:ilvl w:val="0"/>
+          <w:numId w:val="3"/>
+        </w:numPr>
+        <w:spacing w:before="100" w:beforeAutospacing="1" w:after="100" w:afterAutospacing="1" w:line="240" w:lineRule="auto"/>
+        <w:jc w:val="both"/>
+        <w:rPr>
+          <w:rFonts w:ascii="Times New Roman" w:eastAsia="Times New Roman" w:hAnsi="Times New Roman" w:cs="Times New Roman"/>
+          <w:kern w:val="0"/>
+          <w14:ligatures w14:val="none"/>
+        </w:rPr>
+      </w:pPr>
+      <w:r>
+        <w:rPr>
+          <w:rFonts w:ascii="Times New Roman" w:eastAsia="Times New Roman" w:hAnsi="Times New Roman" w:cs="Times New Roman"/>
+          <w:kern w:val="0"/>
+          <w14:ligatures w14:val="none"/>
+        </w:rPr>
+        <w:t>Enseñarle al modelo las relaciones entre componentes del HPC y su resistencia.</w:t>
+      </w:r>
+    </w:p>
+    <w:p>
+      <w:pPr>
+        <w:numPr>
+          <w:ilvl w:val="0"/>
+          <w:numId w:val="3"/>
+        </w:numPr>
+        <w:spacing w:before="100" w:beforeAutospacing="1" w:after="100" w:afterAutospacing="1" w:line="240" w:lineRule="auto"/>
+        <w:jc w:val="both"/>
+        <w:rPr>
+          <w:rFonts w:ascii="Times New Roman" w:eastAsia="Times New Roman" w:hAnsi="Times New Roman" w:cs="Times New Roman"/>
+          <w:kern w:val="0"/>
+          <w14:ligatures w14:val="none"/>
+        </w:rPr>
+      </w:pPr>
+      <w:r>
+        <w:rPr>
+          <w:rFonts w:ascii="Times New Roman" w:eastAsia="Times New Roman" w:hAnsi="Times New Roman" w:cs="Times New Roman"/>
+          <w:kern w:val="0"/>
+          <w14:ligatures w14:val="none"/>
+        </w:rPr>
+        <w:t>Permitir que el modelo prediga nuevas resistencias sin hacer ensayos físicos.</w:t>
+      </w:r>
+    </w:p>
+    <w:p>
+      <w:pPr>
+        <w:numPr>
+          <w:ilvl w:val="0"/>
+          <w:numId w:val="3"/>
+        </w:numPr>
+        <w:spacing w:before="100" w:beforeAutospacing="1" w:after="100" w:afterAutospacing="1" w:line="240" w:lineRule="auto"/>
+        <w:jc w:val="both"/>
         <w:rPr>
           <w:rFonts w:ascii="Times New Roman" w:eastAsia="Times New Roman" w:hAnsi="Times New Roman" w:cs="Times New Roman"/>
           <w:kern w:val="0"/>
@@ -730,6 +1090,7 @@
     <w:p>
       <w:pPr>
         <w:spacing w:before="100" w:beforeAutospacing="1" w:after="100" w:afterAutospacing="1" w:line="240" w:lineRule="auto"/>
+        <w:jc w:val="both"/>
         <w:outlineLvl w:val="1"/>
         <w:rPr>
           <w:rFonts w:ascii="Times New Roman" w:eastAsia="Times New Roman" w:hAnsi="Times New Roman" w:cs="Times New Roman"/>
@@ -747,13 +1108,13 @@
           <w:kern w:val="0"/>
           <w14:ligatures w14:val="none"/>
         </w:rPr>
-        <w:lastRenderedPageBreak/>
         <w:t>6. Descripción del Dataset</w:t>
       </w:r>
     </w:p>
     <w:p>
       <w:pPr>
         <w:spacing w:before="100" w:beforeAutospacing="1" w:after="100" w:afterAutospacing="1" w:line="240" w:lineRule="auto"/>
+        <w:jc w:val="both"/>
         <w:rPr>
           <w:rFonts w:ascii="Times New Roman" w:eastAsia="Times New Roman" w:hAnsi="Times New Roman" w:cs="Times New Roman"/>
           <w:kern w:val="0"/>
@@ -772,6 +1133,7 @@
     <w:p>
       <w:pPr>
         <w:spacing w:before="100" w:beforeAutospacing="1" w:after="100" w:afterAutospacing="1" w:line="240" w:lineRule="auto"/>
+        <w:jc w:val="both"/>
         <w:rPr>
           <w:rFonts w:ascii="Times New Roman" w:eastAsia="Times New Roman" w:hAnsi="Times New Roman" w:cs="Times New Roman"/>
           <w:kern w:val="0"/>
@@ -790,6 +1152,7 @@
     <w:p>
       <w:pPr>
         <w:spacing w:before="100" w:beforeAutospacing="1" w:after="100" w:afterAutospacing="1" w:line="240" w:lineRule="auto"/>
+        <w:jc w:val="both"/>
         <w:rPr>
           <w:rFonts w:ascii="Times New Roman" w:eastAsia="Times New Roman" w:hAnsi="Times New Roman" w:cs="Times New Roman"/>
           <w:kern w:val="0"/>
@@ -812,6 +1175,7 @@
           <w:numId w:val="4"/>
         </w:numPr>
         <w:spacing w:before="100" w:beforeAutospacing="1" w:after="100" w:afterAutospacing="1" w:line="240" w:lineRule="auto"/>
+        <w:jc w:val="both"/>
         <w:rPr>
           <w:rFonts w:ascii="Times New Roman" w:eastAsia="Times New Roman" w:hAnsi="Times New Roman" w:cs="Times New Roman"/>
           <w:kern w:val="0"/>
@@ -834,6 +1198,7 @@
           <w:numId w:val="4"/>
         </w:numPr>
         <w:spacing w:before="100" w:beforeAutospacing="1" w:after="100" w:afterAutospacing="1" w:line="240" w:lineRule="auto"/>
+        <w:jc w:val="both"/>
         <w:rPr>
           <w:rFonts w:ascii="Times New Roman" w:eastAsia="Times New Roman" w:hAnsi="Times New Roman" w:cs="Times New Roman"/>
           <w:kern w:val="0"/>
@@ -856,6 +1221,7 @@
           <w:numId w:val="4"/>
         </w:numPr>
         <w:spacing w:before="100" w:beforeAutospacing="1" w:after="100" w:afterAutospacing="1" w:line="240" w:lineRule="auto"/>
+        <w:jc w:val="both"/>
         <w:rPr>
           <w:rFonts w:ascii="Times New Roman" w:eastAsia="Times New Roman" w:hAnsi="Times New Roman" w:cs="Times New Roman"/>
           <w:kern w:val="0"/>
@@ -874,6 +1240,7 @@
     <w:p>
       <w:pPr>
         <w:spacing w:before="100" w:beforeAutospacing="1" w:after="100" w:afterAutospacing="1" w:line="240" w:lineRule="auto"/>
+        <w:jc w:val="both"/>
         <w:outlineLvl w:val="2"/>
         <w:rPr>
           <w:rFonts w:ascii="Times New Roman" w:eastAsia="Times New Roman" w:hAnsi="Times New Roman" w:cs="Times New Roman"/>
@@ -901,6 +1268,7 @@
           <w:numId w:val="5"/>
         </w:numPr>
         <w:spacing w:before="100" w:beforeAutospacing="1" w:after="100" w:afterAutospacing="1" w:line="240" w:lineRule="auto"/>
+        <w:jc w:val="both"/>
         <w:rPr>
           <w:rFonts w:ascii="Times New Roman" w:eastAsia="Times New Roman" w:hAnsi="Times New Roman" w:cs="Times New Roman"/>
           <w:kern w:val="0"/>
@@ -923,6 +1291,7 @@
           <w:numId w:val="5"/>
         </w:numPr>
         <w:spacing w:before="100" w:beforeAutospacing="1" w:after="100" w:afterAutospacing="1" w:line="240" w:lineRule="auto"/>
+        <w:jc w:val="both"/>
         <w:rPr>
           <w:rFonts w:ascii="Times New Roman" w:eastAsia="Times New Roman" w:hAnsi="Times New Roman" w:cs="Times New Roman"/>
           <w:kern w:val="0"/>
@@ -945,6 +1314,7 @@
           <w:numId w:val="5"/>
         </w:numPr>
         <w:spacing w:before="100" w:beforeAutospacing="1" w:after="100" w:afterAutospacing="1" w:line="240" w:lineRule="auto"/>
+        <w:jc w:val="both"/>
         <w:rPr>
           <w:rFonts w:ascii="Times New Roman" w:eastAsia="Times New Roman" w:hAnsi="Times New Roman" w:cs="Times New Roman"/>
           <w:kern w:val="0"/>
@@ -967,6 +1337,7 @@
           <w:numId w:val="5"/>
         </w:numPr>
         <w:spacing w:before="100" w:beforeAutospacing="1" w:after="100" w:afterAutospacing="1" w:line="240" w:lineRule="auto"/>
+        <w:jc w:val="both"/>
         <w:rPr>
           <w:rFonts w:ascii="Times New Roman" w:eastAsia="Times New Roman" w:hAnsi="Times New Roman" w:cs="Times New Roman"/>
           <w:kern w:val="0"/>
@@ -989,6 +1360,7 @@
           <w:numId w:val="5"/>
         </w:numPr>
         <w:spacing w:before="100" w:beforeAutospacing="1" w:after="100" w:afterAutospacing="1" w:line="240" w:lineRule="auto"/>
+        <w:jc w:val="both"/>
         <w:rPr>
           <w:rFonts w:ascii="Times New Roman" w:eastAsia="Times New Roman" w:hAnsi="Times New Roman" w:cs="Times New Roman"/>
           <w:kern w:val="0"/>
@@ -1011,6 +1383,7 @@
           <w:numId w:val="5"/>
         </w:numPr>
         <w:spacing w:before="100" w:beforeAutospacing="1" w:after="100" w:afterAutospacing="1" w:line="240" w:lineRule="auto"/>
+        <w:jc w:val="both"/>
         <w:rPr>
           <w:rFonts w:ascii="Times New Roman" w:eastAsia="Times New Roman" w:hAnsi="Times New Roman" w:cs="Times New Roman"/>
           <w:kern w:val="0"/>
@@ -1033,6 +1406,7 @@
           <w:numId w:val="5"/>
         </w:numPr>
         <w:spacing w:before="100" w:beforeAutospacing="1" w:after="100" w:afterAutospacing="1" w:line="240" w:lineRule="auto"/>
+        <w:jc w:val="both"/>
         <w:rPr>
           <w:rFonts w:ascii="Times New Roman" w:eastAsia="Times New Roman" w:hAnsi="Times New Roman" w:cs="Times New Roman"/>
           <w:kern w:val="0"/>
@@ -1055,6 +1429,7 @@
           <w:numId w:val="5"/>
         </w:numPr>
         <w:spacing w:before="100" w:beforeAutospacing="1" w:after="100" w:afterAutospacing="1" w:line="240" w:lineRule="auto"/>
+        <w:jc w:val="both"/>
         <w:rPr>
           <w:rFonts w:ascii="Times New Roman" w:eastAsia="Times New Roman" w:hAnsi="Times New Roman" w:cs="Times New Roman"/>
           <w:kern w:val="0"/>
@@ -1073,6 +1448,7 @@
     <w:p>
       <w:pPr>
         <w:spacing w:before="100" w:beforeAutospacing="1" w:after="100" w:afterAutospacing="1" w:line="240" w:lineRule="auto"/>
+        <w:jc w:val="both"/>
         <w:outlineLvl w:val="2"/>
         <w:rPr>
           <w:rFonts w:ascii="Times New Roman" w:eastAsia="Times New Roman" w:hAnsi="Times New Roman" w:cs="Times New Roman"/>
@@ -1100,6 +1476,7 @@
           <w:numId w:val="6"/>
         </w:numPr>
         <w:spacing w:before="100" w:beforeAutospacing="1" w:after="100" w:afterAutospacing="1" w:line="240" w:lineRule="auto"/>
+        <w:jc w:val="both"/>
         <w:rPr>
           <w:rFonts w:ascii="Times New Roman" w:eastAsia="Times New Roman" w:hAnsi="Times New Roman" w:cs="Times New Roman"/>
           <w:kern w:val="0"/>
@@ -1118,6 +1495,7 @@
     <w:p>
       <w:pPr>
         <w:spacing w:before="100" w:beforeAutospacing="1" w:after="100" w:afterAutospacing="1" w:line="240" w:lineRule="auto"/>
+        <w:jc w:val="both"/>
         <w:rPr>
           <w:rFonts w:ascii="Times New Roman" w:eastAsia="Times New Roman" w:hAnsi="Times New Roman" w:cs="Times New Roman"/>
           <w:kern w:val="0"/>
@@ -1136,6 +1514,7 @@
     <w:p>
       <w:pPr>
         <w:spacing w:before="100" w:beforeAutospacing="1" w:after="100" w:afterAutospacing="1" w:line="240" w:lineRule="auto"/>
+        <w:jc w:val="both"/>
         <w:outlineLvl w:val="1"/>
         <w:rPr>
           <w:rFonts w:ascii="Times New Roman" w:eastAsia="Times New Roman" w:hAnsi="Times New Roman" w:cs="Times New Roman"/>
@@ -1159,6 +1538,7 @@
     <w:p>
       <w:pPr>
         <w:spacing w:before="100" w:beforeAutospacing="1" w:after="100" w:afterAutospacing="1" w:line="240" w:lineRule="auto"/>
+        <w:jc w:val="both"/>
         <w:outlineLvl w:val="2"/>
         <w:rPr>
           <w:rFonts w:ascii="Times New Roman" w:eastAsia="Times New Roman" w:hAnsi="Times New Roman" w:cs="Times New Roman"/>
@@ -1182,24 +1562,102 @@
     <w:p>
       <w:pPr>
         <w:spacing w:before="100" w:beforeAutospacing="1" w:after="100" w:afterAutospacing="1" w:line="240" w:lineRule="auto"/>
-        <w:rPr>
-          <w:rFonts w:ascii="Times New Roman" w:eastAsia="Times New Roman" w:hAnsi="Times New Roman" w:cs="Times New Roman"/>
-          <w:kern w:val="0"/>
-          <w14:ligatures w14:val="none"/>
-        </w:rPr>
-      </w:pPr>
-      <w:r>
-        <w:rPr>
-          <w:rFonts w:ascii="Times New Roman" w:eastAsia="Times New Roman" w:hAnsi="Times New Roman" w:cs="Times New Roman"/>
-          <w:kern w:val="0"/>
-          <w14:ligatures w14:val="none"/>
-        </w:rPr>
-        <w:t>La investigación presenta alta predictibilidad debido a que existe una relación directa entre la composición del concreto y su resistencia mecánica. Estudios previos demuestran que las ANN poseen alta capacidad para capturar relaciones no lineales complejas entre variables.</w:t>
-      </w:r>
-    </w:p>
-    <w:p>
-      <w:pPr>
-        <w:spacing w:before="100" w:beforeAutospacing="1" w:after="100" w:afterAutospacing="1" w:line="240" w:lineRule="auto"/>
+        <w:jc w:val="both"/>
+        <w:rPr>
+          <w:rFonts w:ascii="Times New Roman" w:eastAsia="Times New Roman" w:hAnsi="Times New Roman" w:cs="Times New Roman"/>
+          <w:kern w:val="0"/>
+          <w:lang w:val="es-PE"/>
+          <w14:ligatures w14:val="none"/>
+        </w:rPr>
+      </w:pPr>
+      <w:r>
+        <w:rPr>
+          <w:rFonts w:ascii="Times New Roman" w:eastAsia="Times New Roman" w:hAnsi="Times New Roman" w:cs="Times New Roman"/>
+          <w:kern w:val="0"/>
+          <w14:ligatures w14:val="none"/>
+        </w:rPr>
+        <w:lastRenderedPageBreak/>
+        <w:t xml:space="preserve">La investigación </w:t>
+      </w:r>
+      <w:r>
+        <w:rPr>
+          <w:rFonts w:ascii="Times New Roman" w:eastAsia="Times New Roman" w:hAnsi="Times New Roman" w:cs="Times New Roman"/>
+          <w:kern w:val="0"/>
+          <w14:ligatures w14:val="none"/>
+        </w:rPr>
+        <w:t>señala que el modelo obtuvo resultados favorables en la predicción de nuevos diseños de concreto cuando los valores de entrada se encuentran dentro del rango de datos con los que fue entrenado el modelo.</w:t>
+      </w:r>
+    </w:p>
+    <w:p>
+      <w:pPr>
+        <w:spacing w:before="100" w:beforeAutospacing="1" w:after="100" w:afterAutospacing="1" w:line="240" w:lineRule="auto"/>
+        <w:jc w:val="both"/>
+        <w:rPr>
+          <w:rFonts w:ascii="Times New Roman" w:eastAsia="Times New Roman" w:hAnsi="Times New Roman" w:cs="Times New Roman"/>
+          <w:kern w:val="0"/>
+          <w:lang w:val="es-PE"/>
+          <w14:ligatures w14:val="none"/>
+        </w:rPr>
+      </w:pPr>
+      <w:r>
+        <w:rPr>
+          <w:rFonts w:ascii="Times New Roman" w:eastAsia="Times New Roman" w:hAnsi="Times New Roman" w:cs="Times New Roman"/>
+          <w:kern w:val="0"/>
+          <w:lang w:val="es-PE"/>
+          <w14:ligatures w14:val="none"/>
+        </w:rPr>
+        <w:t xml:space="preserve">En ese sentido, </w:t>
+      </w:r>
+      <w:r>
+        <w:rPr>
+          <w:rFonts w:ascii="Times New Roman" w:eastAsia="Times New Roman" w:hAnsi="Times New Roman" w:cs="Times New Roman"/>
+          <w:kern w:val="0"/>
+          <w14:ligatures w14:val="none"/>
+        </w:rPr>
+        <w:t>presenta alta predictibilidad debido a que existe una relación directa entre la composición del concreto y su resistencia mecánica</w:t>
+      </w:r>
+      <w:r>
+        <w:rPr>
+          <w:rFonts w:ascii="Times New Roman" w:eastAsia="Times New Roman" w:hAnsi="Times New Roman" w:cs="Times New Roman"/>
+          <w:kern w:val="0"/>
+          <w:lang w:val="es-PE"/>
+          <w14:ligatures w14:val="none"/>
+        </w:rPr>
+        <w:t>.</w:t>
+      </w:r>
+    </w:p>
+    <w:p>
+      <w:pPr>
+        <w:spacing w:before="100" w:beforeAutospacing="1" w:after="100" w:afterAutospacing="1" w:line="240" w:lineRule="auto"/>
+        <w:jc w:val="both"/>
+        <w:rPr>
+          <w:rFonts w:ascii="Times New Roman" w:eastAsia="Times New Roman" w:hAnsi="Times New Roman" w:cs="Times New Roman"/>
+          <w:kern w:val="0"/>
+          <w14:ligatures w14:val="none"/>
+        </w:rPr>
+      </w:pPr>
+      <w:r>
+        <w:rPr>
+          <w:rFonts w:ascii="Times New Roman" w:eastAsia="Times New Roman" w:hAnsi="Times New Roman" w:cs="Times New Roman"/>
+          <w:kern w:val="0"/>
+          <w:lang w:val="es-PE"/>
+          <w14:ligatures w14:val="none"/>
+        </w:rPr>
+        <w:t>Asimismo, e</w:t>
+      </w:r>
+      <w:r>
+        <w:rPr>
+          <w:rFonts w:ascii="Times New Roman" w:eastAsia="Times New Roman" w:hAnsi="Times New Roman" w:cs="Times New Roman"/>
+          <w:kern w:val="0"/>
+          <w14:ligatures w14:val="none"/>
+        </w:rPr>
+        <w:t>studios previos demuestran que las ANN poseen alta capacidad para capturar relaciones no lineales complejas entre variables.</w:t>
+      </w:r>
+    </w:p>
+    <w:p>
+      <w:pPr>
+        <w:spacing w:before="100" w:beforeAutospacing="1" w:after="100" w:afterAutospacing="1" w:line="240" w:lineRule="auto"/>
+        <w:jc w:val="both"/>
         <w:outlineLvl w:val="2"/>
         <w:rPr>
           <w:rFonts w:ascii="Times New Roman" w:eastAsia="Times New Roman" w:hAnsi="Times New Roman" w:cs="Times New Roman"/>
@@ -1223,24 +1681,80 @@
     <w:p>
       <w:pPr>
         <w:spacing w:before="100" w:beforeAutospacing="1" w:after="100" w:afterAutospacing="1" w:line="240" w:lineRule="auto"/>
-        <w:rPr>
-          <w:rFonts w:ascii="Times New Roman" w:eastAsia="Times New Roman" w:hAnsi="Times New Roman" w:cs="Times New Roman"/>
-          <w:kern w:val="0"/>
-          <w14:ligatures w14:val="none"/>
-        </w:rPr>
-      </w:pPr>
-      <w:r>
-        <w:rPr>
-          <w:rFonts w:ascii="Times New Roman" w:eastAsia="Times New Roman" w:hAnsi="Times New Roman" w:cs="Times New Roman"/>
-          <w:kern w:val="0"/>
-          <w14:ligatures w14:val="none"/>
-        </w:rPr>
-        <w:t>El problema es computacionalmente viable debido al tamaño moderado del dataset y a la disponibilidad de herramientas accesibles como Python, TensorFlow y Scikit-learn, las cuales permiten entrenar modelos en computadoras convencionales.</w:t>
-      </w:r>
-    </w:p>
-    <w:p>
-      <w:pPr>
-        <w:spacing w:before="100" w:beforeAutospacing="1" w:after="100" w:afterAutospacing="1" w:line="240" w:lineRule="auto"/>
+        <w:jc w:val="both"/>
+        <w:rPr>
+          <w:rFonts w:ascii="Times New Roman" w:eastAsia="Times New Roman" w:hAnsi="Times New Roman" w:cs="Times New Roman"/>
+          <w:kern w:val="0"/>
+          <w:lang w:val="es-PE"/>
+          <w14:ligatures w14:val="none"/>
+        </w:rPr>
+      </w:pPr>
+      <w:r>
+        <w:rPr>
+          <w:rFonts w:ascii="Times New Roman" w:eastAsia="Times New Roman" w:hAnsi="Times New Roman" w:cs="Times New Roman"/>
+          <w:kern w:val="0"/>
+          <w14:ligatures w14:val="none"/>
+        </w:rPr>
+        <w:t>El problema es computacionalmente viable debido al tamaño moderado del dataset y a la disponibilidad de herramientas accesibles como Python, TensorFlow y Scikit-learn, las cuales permiten entrenar modelos</w:t>
+      </w:r>
+      <w:r>
+        <w:rPr>
+          <w:rFonts w:ascii="Times New Roman" w:eastAsia="Times New Roman" w:hAnsi="Times New Roman" w:cs="Times New Roman"/>
+          <w:kern w:val="0"/>
+          <w:lang w:val="es-PE"/>
+          <w14:ligatures w14:val="none"/>
+        </w:rPr>
+        <w:t xml:space="preserve"> ejecutables y eficientes</w:t>
+      </w:r>
+      <w:r>
+        <w:rPr>
+          <w:rFonts w:ascii="Times New Roman" w:eastAsia="Times New Roman" w:hAnsi="Times New Roman" w:cs="Times New Roman"/>
+          <w:kern w:val="0"/>
+          <w14:ligatures w14:val="none"/>
+        </w:rPr>
+        <w:t xml:space="preserve"> en computadoras convencionales</w:t>
+      </w:r>
+      <w:r>
+        <w:rPr>
+          <w:rFonts w:ascii="Times New Roman" w:eastAsia="Times New Roman" w:hAnsi="Times New Roman" w:cs="Times New Roman"/>
+          <w:kern w:val="0"/>
+          <w:lang w:val="es-PE"/>
+          <w14:ligatures w14:val="none"/>
+        </w:rPr>
+        <w:t xml:space="preserve"> sin </w:t>
+      </w:r>
+      <w:r>
+        <w:rPr>
+          <w:rFonts w:ascii="Times New Roman" w:eastAsia="Times New Roman" w:hAnsi="Times New Roman" w:cs="Times New Roman"/>
+          <w:kern w:val="0"/>
+          <w:lang w:val="es-PE"/>
+          <w14:ligatures w14:val="none"/>
+        </w:rPr>
+        <w:t>requ</w:t>
+      </w:r>
+      <w:r>
+        <w:rPr>
+          <w:rFonts w:ascii="Times New Roman" w:eastAsia="Times New Roman" w:hAnsi="Times New Roman" w:cs="Times New Roman"/>
+          <w:kern w:val="0"/>
+          <w:lang w:val="es-PE"/>
+          <w14:ligatures w14:val="none"/>
+        </w:rPr>
+        <w:t>erir</w:t>
+      </w:r>
+      <w:r>
+        <w:rPr>
+          <w:rFonts w:ascii="Times New Roman" w:eastAsia="Times New Roman" w:hAnsi="Times New Roman" w:cs="Times New Roman"/>
+          <w:kern w:val="0"/>
+          <w:lang w:val="es-PE"/>
+          <w14:ligatures w14:val="none"/>
+        </w:rPr>
+        <w:t xml:space="preserve"> recursos de alto rendimiento.</w:t>
+      </w:r>
+    </w:p>
+    <w:p>
+      <w:pPr>
+        <w:spacing w:before="100" w:beforeAutospacing="1" w:after="100" w:afterAutospacing="1" w:line="240" w:lineRule="auto"/>
+        <w:jc w:val="both"/>
         <w:outlineLvl w:val="2"/>
         <w:rPr>
           <w:rFonts w:ascii="Times New Roman" w:eastAsia="Times New Roman" w:hAnsi="Times New Roman" w:cs="Times New Roman"/>
@@ -1258,13 +1772,13 @@
           <w:kern w:val="0"/>
           <w14:ligatures w14:val="none"/>
         </w:rPr>
-        <w:lastRenderedPageBreak/>
         <w:t>Estabilidad</w:t>
       </w:r>
     </w:p>
     <w:p>
       <w:pPr>
         <w:spacing w:before="100" w:beforeAutospacing="1" w:after="100" w:afterAutospacing="1" w:line="240" w:lineRule="auto"/>
+        <w:jc w:val="both"/>
         <w:rPr>
           <w:rFonts w:ascii="Times New Roman" w:eastAsia="Times New Roman" w:hAnsi="Times New Roman" w:cs="Times New Roman"/>
           <w:kern w:val="0"/>
@@ -1287,6 +1801,7 @@
           <w:numId w:val="7"/>
         </w:numPr>
         <w:spacing w:before="100" w:beforeAutospacing="1" w:after="100" w:afterAutospacing="1" w:line="240" w:lineRule="auto"/>
+        <w:jc w:val="both"/>
         <w:rPr>
           <w:rFonts w:ascii="Times New Roman" w:eastAsia="Times New Roman" w:hAnsi="Times New Roman" w:cs="Times New Roman"/>
           <w:kern w:val="0"/>
@@ -1309,6 +1824,7 @@
           <w:numId w:val="7"/>
         </w:numPr>
         <w:spacing w:before="100" w:beforeAutospacing="1" w:after="100" w:afterAutospacing="1" w:line="240" w:lineRule="auto"/>
+        <w:jc w:val="both"/>
         <w:rPr>
           <w:rFonts w:ascii="Times New Roman" w:eastAsia="Times New Roman" w:hAnsi="Times New Roman" w:cs="Times New Roman"/>
           <w:kern w:val="0"/>
@@ -1331,6 +1847,7 @@
           <w:numId w:val="7"/>
         </w:numPr>
         <w:spacing w:before="100" w:beforeAutospacing="1" w:after="100" w:afterAutospacing="1" w:line="240" w:lineRule="auto"/>
+        <w:jc w:val="both"/>
         <w:rPr>
           <w:rFonts w:ascii="Times New Roman" w:eastAsia="Times New Roman" w:hAnsi="Times New Roman" w:cs="Times New Roman"/>
           <w:kern w:val="0"/>
@@ -1353,6 +1870,7 @@
           <w:numId w:val="7"/>
         </w:numPr>
         <w:spacing w:before="100" w:beforeAutospacing="1" w:after="100" w:afterAutospacing="1" w:line="240" w:lineRule="auto"/>
+        <w:jc w:val="both"/>
         <w:rPr>
           <w:rFonts w:ascii="Times New Roman" w:eastAsia="Times New Roman" w:hAnsi="Times New Roman" w:cs="Times New Roman"/>
           <w:kern w:val="0"/>
@@ -1371,6 +1889,7 @@
     <w:p>
       <w:pPr>
         <w:spacing w:before="100" w:beforeAutospacing="1" w:after="100" w:afterAutospacing="1" w:line="240" w:lineRule="auto"/>
+        <w:jc w:val="both"/>
         <w:rPr>
           <w:rFonts w:ascii="Times New Roman" w:eastAsia="Times New Roman" w:hAnsi="Times New Roman" w:cs="Times New Roman"/>
           <w:kern w:val="0"/>
@@ -1389,6 +1908,7 @@
     <w:p>
       <w:pPr>
         <w:spacing w:before="100" w:beforeAutospacing="1" w:after="100" w:afterAutospacing="1" w:line="240" w:lineRule="auto"/>
+        <w:jc w:val="both"/>
         <w:outlineLvl w:val="1"/>
         <w:rPr>
           <w:rFonts w:ascii="Times New Roman" w:eastAsia="Times New Roman" w:hAnsi="Times New Roman" w:cs="Times New Roman"/>
@@ -1412,6 +1932,7 @@
     <w:p>
       <w:pPr>
         <w:spacing w:before="100" w:beforeAutospacing="1" w:after="100" w:afterAutospacing="1" w:line="240" w:lineRule="auto"/>
+        <w:jc w:val="both"/>
         <w:rPr>
           <w:rFonts w:ascii="Times New Roman" w:eastAsia="Times New Roman" w:hAnsi="Times New Roman" w:cs="Times New Roman"/>
           <w:kern w:val="0"/>
@@ -1430,6 +1951,7 @@
     <w:p>
       <w:pPr>
         <w:spacing w:before="100" w:beforeAutospacing="1" w:after="100" w:afterAutospacing="1" w:line="240" w:lineRule="auto"/>
+        <w:jc w:val="both"/>
         <w:rPr>
           <w:rFonts w:ascii="Times New Roman" w:eastAsia="Times New Roman" w:hAnsi="Times New Roman" w:cs="Times New Roman"/>
           <w:kern w:val="0"/>
@@ -1448,6 +1970,7 @@
     <w:p>
       <w:pPr>
         <w:spacing w:before="100" w:beforeAutospacing="1" w:after="100" w:afterAutospacing="1" w:line="240" w:lineRule="auto"/>
+        <w:jc w:val="both"/>
         <w:rPr>
           <w:rFonts w:ascii="Times New Roman" w:eastAsia="Times New Roman" w:hAnsi="Times New Roman" w:cs="Times New Roman"/>
           <w:kern w:val="0"/>
@@ -1463,7 +1986,11 @@
         <w:t>Asimismo, la incorporación del framework PCS permitirá desarrollar un modelo robusto, reproducible y técnicamente confiable, alineado con los estándares actuales de ciencia de datos aplicada a la ingeniería.</w:t>
       </w:r>
     </w:p>
-    <w:p/>
+    <w:p>
+      <w:pPr>
+        <w:jc w:val="both"/>
+      </w:pPr>
+    </w:p>
     <w:sectPr>
       <w:pgSz w:w="12240" w:h="15840"/>
       <w:pgMar w:top="1440" w:right="1440" w:bottom="1440" w:left="1440" w:header="708" w:footer="708" w:gutter="0"/>
@@ -1475,7 +2002,7 @@
 </file>
 
 <file path=word/numbering.xml><?xml version="1.0" encoding="utf-8"?>
-<w:numbering xmlns:wpc="http://schemas.microsoft.com/office/word/2010/wordprocessingCanvas" xmlns:cx="http://schemas.microsoft.com/office/drawing/2014/chartex" xmlns:cx1="http://schemas.microsoft.com/office/drawing/2015/9/8/chartex" xmlns:cx2="http://schemas.microsoft.com/office/drawing/2015/10/21/chartex" xmlns:cx3="http://schemas.microsoft.com/office/drawing/2016/5/9/chartex" xmlns:cx4="http://schemas.microsoft.com/office/drawing/2016/5/10/chartex" xmlns:cx5="http://schemas.microsoft.com/office/drawing/2016/5/11/chartex" xmlns:cx6="http://schemas.microsoft.com/office/drawing/2016/5/12/chartex" xmlns:cx7="http://schemas.microsoft.com/office/drawing/2016/5/13/chartex" xmlns:cx8="http://schemas.microsoft.com/office/drawing/2016/5/14/chartex" xmlns:mc="http://schemas.openxmlformats.org/markup-compatibility/2006" xmlns:aink="http://schemas.microsoft.com/office/drawing/2016/ink" xmlns:am3d="http://schemas.microsoft.com/office/drawing/2017/model3d" xmlns:o="urn:schemas-microsoft-com:office:office" xmlns:oel="http://schemas.microsoft.com/office/2019/extlst" xmlns:r="http://schemas.openxmlformats.org/officeDocument/2006/relationships" xmlns:m="http://schemas.openxmlformats.org/officeDocument/2006/math" xmlns:v="urn:schemas-microsoft-com:vml" xmlns:wp14="http://schemas.microsoft.com/office/word/2010/wordprocessingDrawing" xmlns:wp="http://schemas.openxmlformats.org/drawingml/2006/wordprocessingDrawing" xmlns:w10="urn:schemas-microsoft-com:office:word" xmlns:w="http://schemas.openxmlformats.org/wordprocessingml/2006/main" xmlns:w14="http://schemas.microsoft.com/office/word/2010/wordml" xmlns:w15="http://schemas.microsoft.com/office/word/2012/wordml" xmlns:w16cex="http://schemas.microsoft.com/office/word/2018/wordml/cex" xmlns:w16cid="http://schemas.microsoft.com/office/word/2016/wordml/cid" xmlns:w16="http://schemas.microsoft.com/office/word/2018/wordml" xmlns:w16du="http://schemas.microsoft.com/office/word/2023/wordml/word16du" xmlns:w16sdtdh="http://schemas.microsoft.com/office/word/2020/wordml/sdtdatahash" xmlns:w16sdtfl="http://schemas.microsoft.com/office/word/2024/wordml/sdtformatlock" xmlns:w16se="http://schemas.microsoft.com/office/word/2015/wordml/symex" xmlns:wpg="http://schemas.microsoft.com/office/word/2010/wordprocessingGroup" xmlns:wpi="http://schemas.microsoft.com/office/word/2010/wordprocessingInk" xmlns:wne="http://schemas.microsoft.com/office/word/2006/wordml" xmlns:wps="http://schemas.microsoft.com/office/word/2010/wordprocessingShape" mc:Ignorable="w14 w15 w16se w16cid w16 w16cex w16sdtdh w16sdtfl w16du wp14">
+<w:numbering xmlns:wpc="http://schemas.microsoft.com/office/word/2010/wordprocessingCanvas" xmlns:cx="http://schemas.microsoft.com/office/drawing/2014/chartex" xmlns:cx1="http://schemas.microsoft.com/office/drawing/2015/9/8/chartex" xmlns:cx2="http://schemas.microsoft.com/office/drawing/2015/10/21/chartex" xmlns:cx3="http://schemas.microsoft.com/office/drawing/2016/5/9/chartex" xmlns:cx4="http://schemas.microsoft.com/office/drawing/2016/5/10/chartex" xmlns:cx5="http://schemas.microsoft.com/office/drawing/2016/5/11/chartex" xmlns:cx6="http://schemas.microsoft.com/office/drawing/2016/5/12/chartex" xmlns:cx7="http://schemas.microsoft.com/office/drawing/2016/5/13/chartex" xmlns:cx8="http://schemas.microsoft.com/office/drawing/2016/5/14/chartex" xmlns:mc="http://schemas.openxmlformats.org/markup-compatibility/2006" xmlns:aink="http://schemas.microsoft.com/office/drawing/2016/ink" xmlns:am3d="http://schemas.microsoft.com/office/drawing/2017/model3d" xmlns:o="urn:schemas-microsoft-com:office:office" xmlns:oel="http://schemas.microsoft.com/office/2019/extlst" xmlns:r="http://schemas.openxmlformats.org/officeDocument/2006/relationships" xmlns:m="http://schemas.openxmlformats.org/officeDocument/2006/math" xmlns:v="urn:schemas-microsoft-com:vml" xmlns:wp14="http://schemas.microsoft.com/office/word/2010/wordprocessingDrawing" xmlns:wp="http://schemas.openxmlformats.org/drawingml/2006/wordprocessingDrawing" xmlns:w10="urn:schemas-microsoft-com:office:word" xmlns:w="http://schemas.openxmlformats.org/wordprocessingml/2006/main" xmlns:w14="http://schemas.microsoft.com/office/word/2010/wordml" xmlns:w15="http://schemas.microsoft.com/office/word/2012/wordml" xmlns:w16cex="http://schemas.microsoft.com/office/word/2018/wordml/cex" xmlns:w16cid="http://schemas.microsoft.com/office/word/2016/wordml/cid" xmlns:w16="http://schemas.microsoft.com/office/word/2018/wordml" xmlns:w16sdtdh="http://schemas.microsoft.com/office/word/2020/wordml/sdtdatahash" xmlns:w16se="http://schemas.microsoft.com/office/word/2015/wordml/symex" xmlns:wpg="http://schemas.microsoft.com/office/word/2010/wordprocessingGroup" xmlns:wpi="http://schemas.microsoft.com/office/word/2010/wordprocessingInk" xmlns:wne="http://schemas.microsoft.com/office/word/2006/wordml" xmlns:wps="http://schemas.microsoft.com/office/word/2010/wordprocessingShape" mc:Ignorable="w14 w15 w16se w16cid w16 w16cex w16sdtdh wp14">
   <w:abstractNum w:abstractNumId="0" w15:restartNumberingAfterBreak="0">
     <w:nsid w:val="03FA4ED3"/>
     <w:multiLevelType w:val="multilevel"/>
@@ -2544,7 +3071,7 @@
 </file>
 
 <file path=word/styles.xml><?xml version="1.0" encoding="utf-8"?>
-<w:styles xmlns:mc="http://schemas.openxmlformats.org/markup-compatibility/2006" xmlns:r="http://schemas.openxmlformats.org/officeDocument/2006/relationships" xmlns:w="http://schemas.openxmlformats.org/wordprocessingml/2006/main" xmlns:w14="http://schemas.microsoft.com/office/word/2010/wordml" xmlns:w15="http://schemas.microsoft.com/office/word/2012/wordml" xmlns:w16cex="http://schemas.microsoft.com/office/word/2018/wordml/cex" xmlns:w16cid="http://schemas.microsoft.com/office/word/2016/wordml/cid" xmlns:w16="http://schemas.microsoft.com/office/word/2018/wordml" xmlns:w16du="http://schemas.microsoft.com/office/word/2023/wordml/word16du" xmlns:w16sdtdh="http://schemas.microsoft.com/office/word/2020/wordml/sdtdatahash" xmlns:w16sdtfl="http://schemas.microsoft.com/office/word/2024/wordml/sdtformatlock" xmlns:w16se="http://schemas.microsoft.com/office/word/2015/wordml/symex" mc:Ignorable="w14 w15 w16se w16cid w16 w16cex w16sdtdh w16sdtfl w16du">
+<w:styles xmlns:mc="http://schemas.openxmlformats.org/markup-compatibility/2006" xmlns:r="http://schemas.openxmlformats.org/officeDocument/2006/relationships" xmlns:w="http://schemas.openxmlformats.org/wordprocessingml/2006/main" xmlns:w14="http://schemas.microsoft.com/office/word/2010/wordml" xmlns:w15="http://schemas.microsoft.com/office/word/2012/wordml" xmlns:w16cex="http://schemas.microsoft.com/office/word/2018/wordml/cex" xmlns:w16cid="http://schemas.microsoft.com/office/word/2016/wordml/cid" xmlns:w16="http://schemas.microsoft.com/office/word/2018/wordml" xmlns:w16sdtdh="http://schemas.microsoft.com/office/word/2020/wordml/sdtdatahash" xmlns:w16se="http://schemas.microsoft.com/office/word/2015/wordml/symex" mc:Ignorable="w14 w15 w16se w16cid w16 w16cex w16sdtdh">
   <w:docDefaults>
     <w:rPrDefault>
       <w:rPr>
@@ -2552,7 +3079,7 @@
         <w:kern w:val="2"/>
         <w:sz w:val="24"/>
         <w:szCs w:val="24"/>
-        <w:lang w:val="en-PE" w:eastAsia="en-US" w:bidi="ar-SA"/>
+        <w:lang w:eastAsia="en-US" w:bidi="ar-SA"/>
         <w14:ligatures w14:val="standardContextual"/>
       </w:rPr>
     </w:rPrDefault>
@@ -2944,11 +3471,11 @@
     <w:name w:val="Normal"/>
     <w:qFormat/>
   </w:style>
-  <w:style w:type="paragraph" w:styleId="Heading1">
+  <w:style w:type="paragraph" w:styleId="Ttulo1">
     <w:name w:val="heading 1"/>
     <w:basedOn w:val="Normal"/>
     <w:next w:val="Normal"/>
-    <w:link w:val="Heading1Char"/>
+    <w:link w:val="Ttulo1Car"/>
     <w:uiPriority w:val="9"/>
     <w:qFormat/>
     <w:rsid w:val="008558D7"/>
@@ -2965,11 +3492,11 @@
       <w:szCs w:val="40"/>
     </w:rPr>
   </w:style>
-  <w:style w:type="paragraph" w:styleId="Heading2">
+  <w:style w:type="paragraph" w:styleId="Ttulo2">
     <w:name w:val="heading 2"/>
     <w:basedOn w:val="Normal"/>
     <w:next w:val="Normal"/>
-    <w:link w:val="Heading2Char"/>
+    <w:link w:val="Ttulo2Car"/>
     <w:uiPriority w:val="9"/>
     <w:unhideWhenUsed/>
     <w:qFormat/>
@@ -2987,11 +3514,11 @@
       <w:szCs w:val="32"/>
     </w:rPr>
   </w:style>
-  <w:style w:type="paragraph" w:styleId="Heading3">
+  <w:style w:type="paragraph" w:styleId="Ttulo3">
     <w:name w:val="heading 3"/>
     <w:basedOn w:val="Normal"/>
     <w:next w:val="Normal"/>
-    <w:link w:val="Heading3Char"/>
+    <w:link w:val="Ttulo3Car"/>
     <w:uiPriority w:val="9"/>
     <w:unhideWhenUsed/>
     <w:qFormat/>
@@ -3009,11 +3536,11 @@
       <w:szCs w:val="28"/>
     </w:rPr>
   </w:style>
-  <w:style w:type="paragraph" w:styleId="Heading4">
+  <w:style w:type="paragraph" w:styleId="Ttulo4">
     <w:name w:val="heading 4"/>
     <w:basedOn w:val="Normal"/>
     <w:next w:val="Normal"/>
-    <w:link w:val="Heading4Char"/>
+    <w:link w:val="Ttulo4Car"/>
     <w:uiPriority w:val="9"/>
     <w:semiHidden/>
     <w:unhideWhenUsed/>
@@ -3032,11 +3559,11 @@
       <w:color w:val="0F4761" w:themeColor="accent1" w:themeShade="BF"/>
     </w:rPr>
   </w:style>
-  <w:style w:type="paragraph" w:styleId="Heading5">
+  <w:style w:type="paragraph" w:styleId="Ttulo5">
     <w:name w:val="heading 5"/>
     <w:basedOn w:val="Normal"/>
     <w:next w:val="Normal"/>
-    <w:link w:val="Heading5Char"/>
+    <w:link w:val="Ttulo5Car"/>
     <w:uiPriority w:val="9"/>
     <w:semiHidden/>
     <w:unhideWhenUsed/>
@@ -3053,11 +3580,11 @@
       <w:color w:val="0F4761" w:themeColor="accent1" w:themeShade="BF"/>
     </w:rPr>
   </w:style>
-  <w:style w:type="paragraph" w:styleId="Heading6">
+  <w:style w:type="paragraph" w:styleId="Ttulo6">
     <w:name w:val="heading 6"/>
     <w:basedOn w:val="Normal"/>
     <w:next w:val="Normal"/>
-    <w:link w:val="Heading6Char"/>
+    <w:link w:val="Ttulo6Car"/>
     <w:uiPriority w:val="9"/>
     <w:semiHidden/>
     <w:unhideWhenUsed/>
@@ -3076,11 +3603,11 @@
       <w:color w:val="595959" w:themeColor="text1" w:themeTint="A6"/>
     </w:rPr>
   </w:style>
-  <w:style w:type="paragraph" w:styleId="Heading7">
+  <w:style w:type="paragraph" w:styleId="Ttulo7">
     <w:name w:val="heading 7"/>
     <w:basedOn w:val="Normal"/>
     <w:next w:val="Normal"/>
-    <w:link w:val="Heading7Char"/>
+    <w:link w:val="Ttulo7Car"/>
     <w:uiPriority w:val="9"/>
     <w:semiHidden/>
     <w:unhideWhenUsed/>
@@ -3097,11 +3624,11 @@
       <w:color w:val="595959" w:themeColor="text1" w:themeTint="A6"/>
     </w:rPr>
   </w:style>
-  <w:style w:type="paragraph" w:styleId="Heading8">
+  <w:style w:type="paragraph" w:styleId="Ttulo8">
     <w:name w:val="heading 8"/>
     <w:basedOn w:val="Normal"/>
     <w:next w:val="Normal"/>
-    <w:link w:val="Heading8Char"/>
+    <w:link w:val="Ttulo8Car"/>
     <w:uiPriority w:val="9"/>
     <w:semiHidden/>
     <w:unhideWhenUsed/>
@@ -3120,11 +3647,11 @@
       <w:color w:val="272727" w:themeColor="text1" w:themeTint="D8"/>
     </w:rPr>
   </w:style>
-  <w:style w:type="paragraph" w:styleId="Heading9">
+  <w:style w:type="paragraph" w:styleId="Ttulo9">
     <w:name w:val="heading 9"/>
     <w:basedOn w:val="Normal"/>
     <w:next w:val="Normal"/>
-    <w:link w:val="Heading9Char"/>
+    <w:link w:val="Ttulo9Car"/>
     <w:uiPriority w:val="9"/>
     <w:semiHidden/>
     <w:unhideWhenUsed/>
@@ -3141,13 +3668,12 @@
       <w:color w:val="272727" w:themeColor="text1" w:themeTint="D8"/>
     </w:rPr>
   </w:style>
-  <w:style w:type="character" w:default="1" w:styleId="DefaultParagraphFont">
+  <w:style w:type="character" w:default="1" w:styleId="Fuentedeprrafopredeter">
     <w:name w:val="Default Paragraph Font"/>
     <w:uiPriority w:val="1"/>
-    <w:semiHidden/>
     <w:unhideWhenUsed/>
   </w:style>
-  <w:style w:type="table" w:default="1" w:styleId="TableNormal">
+  <w:style w:type="table" w:default="1" w:styleId="Tablanormal">
     <w:name w:val="Normal Table"/>
     <w:uiPriority w:val="99"/>
     <w:semiHidden/>
@@ -3162,16 +3688,16 @@
       </w:tblCellMar>
     </w:tblPr>
   </w:style>
-  <w:style w:type="numbering" w:default="1" w:styleId="NoList">
+  <w:style w:type="numbering" w:default="1" w:styleId="Sinlista">
     <w:name w:val="No List"/>
     <w:uiPriority w:val="99"/>
     <w:semiHidden/>
     <w:unhideWhenUsed/>
   </w:style>
-  <w:style w:type="character" w:customStyle="1" w:styleId="Heading1Char">
-    <w:name w:val="Heading 1 Char"/>
-    <w:basedOn w:val="DefaultParagraphFont"/>
-    <w:link w:val="Heading1"/>
+  <w:style w:type="character" w:customStyle="1" w:styleId="Ttulo1Car">
+    <w:name w:val="Título 1 Car"/>
+    <w:basedOn w:val="Fuentedeprrafopredeter"/>
+    <w:link w:val="Ttulo1"/>
     <w:uiPriority w:val="9"/>
     <w:rsid w:val="008558D7"/>
     <w:rPr>
@@ -3181,10 +3707,10 @@
       <w:szCs w:val="40"/>
     </w:rPr>
   </w:style>
-  <w:style w:type="character" w:customStyle="1" w:styleId="Heading2Char">
-    <w:name w:val="Heading 2 Char"/>
-    <w:basedOn w:val="DefaultParagraphFont"/>
-    <w:link w:val="Heading2"/>
+  <w:style w:type="character" w:customStyle="1" w:styleId="Ttulo2Car">
+    <w:name w:val="Título 2 Car"/>
+    <w:basedOn w:val="Fuentedeprrafopredeter"/>
+    <w:link w:val="Ttulo2"/>
     <w:uiPriority w:val="9"/>
     <w:rsid w:val="008558D7"/>
     <w:rPr>
@@ -3194,10 +3720,10 @@
       <w:szCs w:val="32"/>
     </w:rPr>
   </w:style>
-  <w:style w:type="character" w:customStyle="1" w:styleId="Heading3Char">
-    <w:name w:val="Heading 3 Char"/>
-    <w:basedOn w:val="DefaultParagraphFont"/>
-    <w:link w:val="Heading3"/>
+  <w:style w:type="character" w:customStyle="1" w:styleId="Ttulo3Car">
+    <w:name w:val="Título 3 Car"/>
+    <w:basedOn w:val="Fuentedeprrafopredeter"/>
+    <w:link w:val="Ttulo3"/>
     <w:uiPriority w:val="9"/>
     <w:rsid w:val="008558D7"/>
     <w:rPr>
@@ -3207,10 +3733,10 @@
       <w:szCs w:val="28"/>
     </w:rPr>
   </w:style>
-  <w:style w:type="character" w:customStyle="1" w:styleId="Heading4Char">
-    <w:name w:val="Heading 4 Char"/>
-    <w:basedOn w:val="DefaultParagraphFont"/>
-    <w:link w:val="Heading4"/>
+  <w:style w:type="character" w:customStyle="1" w:styleId="Ttulo4Car">
+    <w:name w:val="Título 4 Car"/>
+    <w:basedOn w:val="Fuentedeprrafopredeter"/>
+    <w:link w:val="Ttulo4"/>
     <w:uiPriority w:val="9"/>
     <w:semiHidden/>
     <w:rsid w:val="008558D7"/>
@@ -3221,10 +3747,10 @@
       <w:color w:val="0F4761" w:themeColor="accent1" w:themeShade="BF"/>
     </w:rPr>
   </w:style>
-  <w:style w:type="character" w:customStyle="1" w:styleId="Heading5Char">
-    <w:name w:val="Heading 5 Char"/>
-    <w:basedOn w:val="DefaultParagraphFont"/>
-    <w:link w:val="Heading5"/>
+  <w:style w:type="character" w:customStyle="1" w:styleId="Ttulo5Car">
+    <w:name w:val="Título 5 Car"/>
+    <w:basedOn w:val="Fuentedeprrafopredeter"/>
+    <w:link w:val="Ttulo5"/>
     <w:uiPriority w:val="9"/>
     <w:semiHidden/>
     <w:rsid w:val="008558D7"/>
@@ -3233,10 +3759,10 @@
       <w:color w:val="0F4761" w:themeColor="accent1" w:themeShade="BF"/>
     </w:rPr>
   </w:style>
-  <w:style w:type="character" w:customStyle="1" w:styleId="Heading6Char">
-    <w:name w:val="Heading 6 Char"/>
-    <w:basedOn w:val="DefaultParagraphFont"/>
-    <w:link w:val="Heading6"/>
+  <w:style w:type="character" w:customStyle="1" w:styleId="Ttulo6Car">
+    <w:name w:val="Título 6 Car"/>
+    <w:basedOn w:val="Fuentedeprrafopredeter"/>
+    <w:link w:val="Ttulo6"/>
     <w:uiPriority w:val="9"/>
     <w:semiHidden/>
     <w:rsid w:val="008558D7"/>
@@ -3247,10 +3773,10 @@
       <w:color w:val="595959" w:themeColor="text1" w:themeTint="A6"/>
     </w:rPr>
   </w:style>
-  <w:style w:type="character" w:customStyle="1" w:styleId="Heading7Char">
-    <w:name w:val="Heading 7 Char"/>
-    <w:basedOn w:val="DefaultParagraphFont"/>
-    <w:link w:val="Heading7"/>
+  <w:style w:type="character" w:customStyle="1" w:styleId="Ttulo7Car">
+    <w:name w:val="Título 7 Car"/>
+    <w:basedOn w:val="Fuentedeprrafopredeter"/>
+    <w:link w:val="Ttulo7"/>
     <w:uiPriority w:val="9"/>
     <w:semiHidden/>
     <w:rsid w:val="008558D7"/>
@@ -3259,10 +3785,10 @@
       <w:color w:val="595959" w:themeColor="text1" w:themeTint="A6"/>
     </w:rPr>
   </w:style>
-  <w:style w:type="character" w:customStyle="1" w:styleId="Heading8Char">
-    <w:name w:val="Heading 8 Char"/>
-    <w:basedOn w:val="DefaultParagraphFont"/>
-    <w:link w:val="Heading8"/>
+  <w:style w:type="character" w:customStyle="1" w:styleId="Ttulo8Car">
+    <w:name w:val="Título 8 Car"/>
+    <w:basedOn w:val="Fuentedeprrafopredeter"/>
+    <w:link w:val="Ttulo8"/>
     <w:uiPriority w:val="9"/>
     <w:semiHidden/>
     <w:rsid w:val="008558D7"/>
@@ -3273,10 +3799,10 @@
       <w:color w:val="272727" w:themeColor="text1" w:themeTint="D8"/>
     </w:rPr>
   </w:style>
-  <w:style w:type="character" w:customStyle="1" w:styleId="Heading9Char">
-    <w:name w:val="Heading 9 Char"/>
-    <w:basedOn w:val="DefaultParagraphFont"/>
-    <w:link w:val="Heading9"/>
+  <w:style w:type="character" w:customStyle="1" w:styleId="Ttulo9Car">
+    <w:name w:val="Título 9 Car"/>
+    <w:basedOn w:val="Fuentedeprrafopredeter"/>
+    <w:link w:val="Ttulo9"/>
     <w:uiPriority w:val="9"/>
     <w:semiHidden/>
     <w:rsid w:val="008558D7"/>
@@ -3285,11 +3811,11 @@
       <w:color w:val="272727" w:themeColor="text1" w:themeTint="D8"/>
     </w:rPr>
   </w:style>
-  <w:style w:type="paragraph" w:styleId="Title">
+  <w:style w:type="paragraph" w:styleId="Ttulo">
     <w:name w:val="Title"/>
     <w:basedOn w:val="Normal"/>
     <w:next w:val="Normal"/>
-    <w:link w:val="TitleChar"/>
+    <w:link w:val="TtuloCar"/>
     <w:uiPriority w:val="10"/>
     <w:qFormat/>
     <w:rsid w:val="008558D7"/>
@@ -3305,10 +3831,10 @@
       <w:szCs w:val="56"/>
     </w:rPr>
   </w:style>
-  <w:style w:type="character" w:customStyle="1" w:styleId="TitleChar">
-    <w:name w:val="Title Char"/>
-    <w:basedOn w:val="DefaultParagraphFont"/>
-    <w:link w:val="Title"/>
+  <w:style w:type="character" w:customStyle="1" w:styleId="TtuloCar">
+    <w:name w:val="Título Car"/>
+    <w:basedOn w:val="Fuentedeprrafopredeter"/>
+    <w:link w:val="Ttulo"/>
     <w:uiPriority w:val="10"/>
     <w:rsid w:val="008558D7"/>
     <w:rPr>
@@ -3319,11 +3845,11 @@
       <w:szCs w:val="56"/>
     </w:rPr>
   </w:style>
-  <w:style w:type="paragraph" w:styleId="Subtitle">
+  <w:style w:type="paragraph" w:styleId="Subttulo">
     <w:name w:val="Subtitle"/>
     <w:basedOn w:val="Normal"/>
     <w:next w:val="Normal"/>
-    <w:link w:val="SubtitleChar"/>
+    <w:link w:val="SubttuloCar"/>
     <w:uiPriority w:val="11"/>
     <w:qFormat/>
     <w:rsid w:val="008558D7"/>
@@ -3340,10 +3866,10 @@
       <w:szCs w:val="28"/>
     </w:rPr>
   </w:style>
-  <w:style w:type="character" w:customStyle="1" w:styleId="SubtitleChar">
-    <w:name w:val="Subtitle Char"/>
-    <w:basedOn w:val="DefaultParagraphFont"/>
-    <w:link w:val="Subtitle"/>
+  <w:style w:type="character" w:customStyle="1" w:styleId="SubttuloCar">
+    <w:name w:val="Subtítulo Car"/>
+    <w:basedOn w:val="Fuentedeprrafopredeter"/>
+    <w:link w:val="Subttulo"/>
     <w:uiPriority w:val="11"/>
     <w:rsid w:val="008558D7"/>
     <w:rPr>
@@ -3354,11 +3880,11 @@
       <w:szCs w:val="28"/>
     </w:rPr>
   </w:style>
-  <w:style w:type="paragraph" w:styleId="Quote">
+  <w:style w:type="paragraph" w:styleId="Cita">
     <w:name w:val="Quote"/>
     <w:basedOn w:val="Normal"/>
     <w:next w:val="Normal"/>
-    <w:link w:val="QuoteChar"/>
+    <w:link w:val="CitaCar"/>
     <w:uiPriority w:val="29"/>
     <w:qFormat/>
     <w:rsid w:val="008558D7"/>
@@ -3372,10 +3898,10 @@
       <w:color w:val="404040" w:themeColor="text1" w:themeTint="BF"/>
     </w:rPr>
   </w:style>
-  <w:style w:type="character" w:customStyle="1" w:styleId="QuoteChar">
-    <w:name w:val="Quote Char"/>
-    <w:basedOn w:val="DefaultParagraphFont"/>
-    <w:link w:val="Quote"/>
+  <w:style w:type="character" w:customStyle="1" w:styleId="CitaCar">
+    <w:name w:val="Cita Car"/>
+    <w:basedOn w:val="Fuentedeprrafopredeter"/>
+    <w:link w:val="Cita"/>
     <w:uiPriority w:val="29"/>
     <w:rsid w:val="008558D7"/>
     <w:rPr>
@@ -3384,7 +3910,7 @@
       <w:color w:val="404040" w:themeColor="text1" w:themeTint="BF"/>
     </w:rPr>
   </w:style>
-  <w:style w:type="paragraph" w:styleId="ListParagraph">
+  <w:style w:type="paragraph" w:styleId="Prrafodelista">
     <w:name w:val="List Paragraph"/>
     <w:basedOn w:val="Normal"/>
     <w:uiPriority w:val="34"/>
@@ -3395,9 +3921,9 @@
       <w:contextualSpacing/>
     </w:pPr>
   </w:style>
-  <w:style w:type="character" w:styleId="IntenseEmphasis">
+  <w:style w:type="character" w:styleId="nfasisintenso">
     <w:name w:val="Intense Emphasis"/>
-    <w:basedOn w:val="DefaultParagraphFont"/>
+    <w:basedOn w:val="Fuentedeprrafopredeter"/>
     <w:uiPriority w:val="21"/>
     <w:qFormat/>
     <w:rsid w:val="008558D7"/>
@@ -3407,11 +3933,11 @@
       <w:color w:val="0F4761" w:themeColor="accent1" w:themeShade="BF"/>
     </w:rPr>
   </w:style>
-  <w:style w:type="paragraph" w:styleId="IntenseQuote">
+  <w:style w:type="paragraph" w:styleId="Citadestacada">
     <w:name w:val="Intense Quote"/>
     <w:basedOn w:val="Normal"/>
     <w:next w:val="Normal"/>
-    <w:link w:val="IntenseQuoteChar"/>
+    <w:link w:val="CitadestacadaCar"/>
     <w:uiPriority w:val="30"/>
     <w:qFormat/>
     <w:rsid w:val="008558D7"/>
@@ -3430,10 +3956,10 @@
       <w:color w:val="0F4761" w:themeColor="accent1" w:themeShade="BF"/>
     </w:rPr>
   </w:style>
-  <w:style w:type="character" w:customStyle="1" w:styleId="IntenseQuoteChar">
-    <w:name w:val="Intense Quote Char"/>
-    <w:basedOn w:val="DefaultParagraphFont"/>
-    <w:link w:val="IntenseQuote"/>
+  <w:style w:type="character" w:customStyle="1" w:styleId="CitadestacadaCar">
+    <w:name w:val="Cita destacada Car"/>
+    <w:basedOn w:val="Fuentedeprrafopredeter"/>
+    <w:link w:val="Citadestacada"/>
     <w:uiPriority w:val="30"/>
     <w:rsid w:val="008558D7"/>
     <w:rPr>
@@ -3442,9 +3968,9 @@
       <w:color w:val="0F4761" w:themeColor="accent1" w:themeShade="BF"/>
     </w:rPr>
   </w:style>
-  <w:style w:type="character" w:styleId="IntenseReference">
+  <w:style w:type="character" w:styleId="Referenciaintensa">
     <w:name w:val="Intense Reference"/>
-    <w:basedOn w:val="DefaultParagraphFont"/>
+    <w:basedOn w:val="Fuentedeprrafopredeter"/>
     <w:uiPriority w:val="32"/>
     <w:qFormat/>
     <w:rsid w:val="008558D7"/>
@@ -3471,7 +3997,7 @@
   </w:style>
   <w:style w:type="character" w:customStyle="1" w:styleId="s1">
     <w:name w:val="s1"/>
-    <w:basedOn w:val="DefaultParagraphFont"/>
+    <w:basedOn w:val="Fuentedeprrafopredeter"/>
     <w:rsid w:val="008558D7"/>
   </w:style>
   <w:style w:type="paragraph" w:customStyle="1" w:styleId="p3">

</xml_diff>